<commit_message>
feat: add On_tap_ML.docx report to reports directory
</commit_message>
<xml_diff>
--- a/reports/On_tap_ML.docx
+++ b/reports/On_tap_ML.docx
@@ -31,16 +31,16 @@
         <w:jc w:val="both"/>
       </w:pPr>
       <w:r>
-        <w:t xml:space="preserve">Toàn bộ code nằm trong file </w:t>
+        <w:t xml:space="preserve">Mỗi câu có một file code riêng trong thư mục </w:t>
       </w:r>
       <w:r>
         <w:rPr>
           <w:b/>
         </w:rPr>
-        <w:t>reports/on_tap_ml.py</w:t>
-      </w:r>
-      <w:r>
-        <w:t xml:space="preserve"> (chạy: python reports/on_tap_ml.py). Mỗi phần có lệnh assert đối chiếu với ví dụ số trong slide, nên nếu công thức sai thì chương trình báo lỗi ngay.</w:t>
+        <w:t>reports/code/</w:t>
+      </w:r>
+      <w:r>
+        <w:t>, chạy độc lập được. Mỗi file có lệnh assert đối chiếu với ví dụ số trong slide, nên nếu công thức sai thì chương trình báo lỗi ngay.</w:t>
       </w:r>
     </w:p>
     <w:p>
@@ -66,17 +66,7 @@
           <w:rFonts w:ascii="Consolas" w:hAnsi="Consolas" w:eastAsia="Consolas"/>
           <w:sz w:val="17"/>
         </w:rPr>
-        <w:t>python reports/on_tap_ml.py roc.png   # roc.png là tham số tuỳ chọn để lưu đồ thị ROC</w:t>
-      </w:r>
-    </w:p>
-    <w:p>
-      <w:pPr>
-        <w:spacing w:after="40"/>
-      </w:pPr>
-    </w:p>
-    <w:p>
-      <w:r>
-        <w:t>Phần import dùng chung cho mọi đoạn code bên dưới:</w:t>
+        <w:t>python reports/code/cau1_parametric.py</w:t>
       </w:r>
     </w:p>
     <w:p>
@@ -89,7 +79,7 @@
           <w:rFonts w:ascii="Consolas" w:hAnsi="Consolas" w:eastAsia="Consolas"/>
           <w:sz w:val="17"/>
         </w:rPr>
-        <w:t>"""Code minh hoa cho 5 cau hoi on tap ML (dua tren bai giang ML-01, 03, 04, 06, 07).</w:t>
+        <w:t>python reports/code/cau2_generative.py</w:t>
       </w:r>
     </w:p>
     <w:p>
@@ -102,7 +92,7 @@
           <w:rFonts w:ascii="Consolas" w:hAnsi="Consolas" w:eastAsia="Consolas"/>
           <w:sz w:val="17"/>
         </w:rPr>
-        <w:t xml:space="preserve"> </w:t>
+        <w:t>python reports/code/cau3_logistic.py</w:t>
       </w:r>
     </w:p>
     <w:p>
@@ -115,7 +105,7 @@
           <w:rFonts w:ascii="Consolas" w:hAnsi="Consolas" w:eastAsia="Consolas"/>
           <w:sz w:val="17"/>
         </w:rPr>
-        <w:t>Chay:  python reports/on_tap_ml.py</w:t>
+        <w:t>python reports/code/cau4_losses.py</w:t>
       </w:r>
     </w:p>
     <w:p>
@@ -128,163 +118,7 @@
           <w:rFonts w:ascii="Consolas" w:hAnsi="Consolas" w:eastAsia="Consolas"/>
           <w:sz w:val="17"/>
         </w:rPr>
-        <w:t>Moi phan co assert doi chieu voi vi du so trong slide -&gt; sai cong thuc la bao loi ngay.</w:t>
-      </w:r>
-    </w:p>
-    <w:p>
-      <w:pPr>
-        <w:shd w:val="clear" w:color="auto" w:fill="F3F4F6"/>
-        <w:spacing w:after="0" w:before="0" w:line="240" w:lineRule="auto"/>
-      </w:pPr>
-      <w:r>
-        <w:rPr>
-          <w:rFonts w:ascii="Consolas" w:hAnsi="Consolas" w:eastAsia="Consolas"/>
-          <w:sz w:val="17"/>
-        </w:rPr>
-        <w:t>"""</w:t>
-      </w:r>
-    </w:p>
-    <w:p>
-      <w:pPr>
-        <w:shd w:val="clear" w:color="auto" w:fill="F3F4F6"/>
-        <w:spacing w:after="0" w:before="0" w:line="240" w:lineRule="auto"/>
-      </w:pPr>
-      <w:r>
-        <w:rPr>
-          <w:rFonts w:ascii="Consolas" w:hAnsi="Consolas" w:eastAsia="Consolas"/>
-          <w:sz w:val="17"/>
-        </w:rPr>
-        <w:t>import numpy as np</w:t>
-      </w:r>
-    </w:p>
-    <w:p>
-      <w:pPr>
-        <w:shd w:val="clear" w:color="auto" w:fill="F3F4F6"/>
-        <w:spacing w:after="0" w:before="0" w:line="240" w:lineRule="auto"/>
-      </w:pPr>
-      <w:r>
-        <w:rPr>
-          <w:rFonts w:ascii="Consolas" w:hAnsi="Consolas" w:eastAsia="Consolas"/>
-          <w:sz w:val="17"/>
-        </w:rPr>
-        <w:t>from sklearn.datasets import make_classification</w:t>
-      </w:r>
-    </w:p>
-    <w:p>
-      <w:pPr>
-        <w:shd w:val="clear" w:color="auto" w:fill="F3F4F6"/>
-        <w:spacing w:after="0" w:before="0" w:line="240" w:lineRule="auto"/>
-      </w:pPr>
-      <w:r>
-        <w:rPr>
-          <w:rFonts w:ascii="Consolas" w:hAnsi="Consolas" w:eastAsia="Consolas"/>
-          <w:sz w:val="17"/>
-        </w:rPr>
-        <w:t>from sklearn.linear_model import LogisticRegression</w:t>
-      </w:r>
-    </w:p>
-    <w:p>
-      <w:pPr>
-        <w:shd w:val="clear" w:color="auto" w:fill="F3F4F6"/>
-        <w:spacing w:after="0" w:before="0" w:line="240" w:lineRule="auto"/>
-      </w:pPr>
-      <w:r>
-        <w:rPr>
-          <w:rFonts w:ascii="Consolas" w:hAnsi="Consolas" w:eastAsia="Consolas"/>
-          <w:sz w:val="17"/>
-        </w:rPr>
-        <w:t>from sklearn.metrics import (accuracy_score, confusion_matrix, f1_score, precision_score,</w:t>
-      </w:r>
-    </w:p>
-    <w:p>
-      <w:pPr>
-        <w:shd w:val="clear" w:color="auto" w:fill="F3F4F6"/>
-        <w:spacing w:after="0" w:before="0" w:line="240" w:lineRule="auto"/>
-      </w:pPr>
-      <w:r>
-        <w:rPr>
-          <w:rFonts w:ascii="Consolas" w:hAnsi="Consolas" w:eastAsia="Consolas"/>
-          <w:sz w:val="17"/>
-        </w:rPr>
-        <w:t xml:space="preserve">                             recall_score, roc_auc_score, roc_curve)</w:t>
-      </w:r>
-    </w:p>
-    <w:p>
-      <w:pPr>
-        <w:shd w:val="clear" w:color="auto" w:fill="F3F4F6"/>
-        <w:spacing w:after="0" w:before="0" w:line="240" w:lineRule="auto"/>
-      </w:pPr>
-      <w:r>
-        <w:rPr>
-          <w:rFonts w:ascii="Consolas" w:hAnsi="Consolas" w:eastAsia="Consolas"/>
-          <w:sz w:val="17"/>
-        </w:rPr>
-        <w:t>from sklearn.model_selection import train_test_split</w:t>
-      </w:r>
-    </w:p>
-    <w:p>
-      <w:pPr>
-        <w:shd w:val="clear" w:color="auto" w:fill="F3F4F6"/>
-        <w:spacing w:after="0" w:before="0" w:line="240" w:lineRule="auto"/>
-      </w:pPr>
-      <w:r>
-        <w:rPr>
-          <w:rFonts w:ascii="Consolas" w:hAnsi="Consolas" w:eastAsia="Consolas"/>
-          <w:sz w:val="17"/>
-        </w:rPr>
-        <w:t>from sklearn.naive_bayes import GaussianNB</w:t>
-      </w:r>
-    </w:p>
-    <w:p>
-      <w:pPr>
-        <w:shd w:val="clear" w:color="auto" w:fill="F3F4F6"/>
-        <w:spacing w:after="0" w:before="0" w:line="240" w:lineRule="auto"/>
-      </w:pPr>
-      <w:r>
-        <w:rPr>
-          <w:rFonts w:ascii="Consolas" w:hAnsi="Consolas" w:eastAsia="Consolas"/>
-          <w:sz w:val="17"/>
-        </w:rPr>
-        <w:t>from sklearn.neighbors import KNeighborsClassifier</w:t>
-      </w:r>
-    </w:p>
-    <w:p>
-      <w:pPr>
-        <w:shd w:val="clear" w:color="auto" w:fill="F3F4F6"/>
-        <w:spacing w:after="0" w:before="0" w:line="240" w:lineRule="auto"/>
-      </w:pPr>
-      <w:r>
-        <w:rPr>
-          <w:rFonts w:ascii="Consolas" w:hAnsi="Consolas" w:eastAsia="Consolas"/>
-          <w:sz w:val="17"/>
-        </w:rPr>
-        <w:t>from sklearn.tree import DecisionTreeClassifier</w:t>
-      </w:r>
-    </w:p>
-    <w:p>
-      <w:pPr>
-        <w:shd w:val="clear" w:color="auto" w:fill="F3F4F6"/>
-        <w:spacing w:after="0" w:before="0" w:line="240" w:lineRule="auto"/>
-      </w:pPr>
-      <w:r>
-        <w:rPr>
-          <w:rFonts w:ascii="Consolas" w:hAnsi="Consolas" w:eastAsia="Consolas"/>
-          <w:sz w:val="17"/>
-        </w:rPr>
-        <w:t xml:space="preserve"> </w:t>
-      </w:r>
-    </w:p>
-    <w:p>
-      <w:pPr>
-        <w:shd w:val="clear" w:color="auto" w:fill="F3F4F6"/>
-        <w:spacing w:after="0" w:before="0" w:line="240" w:lineRule="auto"/>
-      </w:pPr>
-      <w:r>
-        <w:rPr>
-          <w:rFonts w:ascii="Consolas" w:hAnsi="Consolas" w:eastAsia="Consolas"/>
-          <w:sz w:val="17"/>
-        </w:rPr>
-        <w:t>rng = np.random.default_rng(0)</w:t>
+        <w:t>python reports/code/cau5_metrics.py roc.png   # roc.png: tuỳ chọn, lưu đồ thị ROC</w:t>
       </w:r>
     </w:p>
     <w:p>
@@ -1110,7 +944,7 @@
         <w:pStyle w:val="Heading2"/>
       </w:pPr>
       <w:r>
-        <w:t>Code minh hoạ</w:t>
+        <w:t>Code minh hoạ: reports/code/cau1_parametric.py</w:t>
       </w:r>
     </w:p>
     <w:p>
@@ -1123,7 +957,7 @@
           <w:rFonts w:ascii="Consolas" w:hAnsi="Consolas" w:eastAsia="Consolas"/>
           <w:sz w:val="17"/>
         </w:rPr>
-        <w:t>def cau1_parametric_vs_nonparametric():</w:t>
+        <w:t>"""Cau 1. PARAMETRIC vs NON-PARAMETRIC.</w:t>
       </w:r>
     </w:p>
     <w:p>
@@ -1136,7 +970,7 @@
           <w:rFonts w:ascii="Consolas" w:hAnsi="Consolas" w:eastAsia="Consolas"/>
           <w:sz w:val="17"/>
         </w:rPr>
-        <w:t xml:space="preserve">    print("\n=== CAU 1: Parametric vs Non-parametric ===")</w:t>
+        <w:t xml:space="preserve"> </w:t>
       </w:r>
     </w:p>
     <w:p>
@@ -1149,7 +983,7 @@
           <w:rFonts w:ascii="Consolas" w:hAnsi="Consolas" w:eastAsia="Consolas"/>
           <w:sz w:val="17"/>
         </w:rPr>
-        <w:t xml:space="preserve">    print(f"{'n_train':&gt;8} | {'LogReg (#tham so)':&gt;18} | {'KNN (#so luu)':&gt;14} | {'Tree (#node)':&gt;12}")</w:t>
+        <w:t>So tham so cua mo hinh tham so (Logistic Regression) co dinh, con mo hinh phi tham so</w:t>
       </w:r>
     </w:p>
     <w:p>
@@ -1162,7 +996,7 @@
           <w:rFonts w:ascii="Consolas" w:hAnsi="Consolas" w:eastAsia="Consolas"/>
           <w:sz w:val="17"/>
         </w:rPr>
-        <w:t xml:space="preserve">    for n in [100, 1000, 10000]:</w:t>
+        <w:t>(KNN, Decision Tree) tang theo so mau huan luyen.</w:t>
       </w:r>
     </w:p>
     <w:p>
@@ -1175,7 +1009,7 @@
           <w:rFonts w:ascii="Consolas" w:hAnsi="Consolas" w:eastAsia="Consolas"/>
           <w:sz w:val="17"/>
         </w:rPr>
-        <w:t xml:space="preserve">        X, y = make_classification(n_samples=n, n_features=5, random_state=0)</w:t>
+        <w:t>Chay: python reports/code/cau1_parametric.py</w:t>
       </w:r>
     </w:p>
     <w:p>
@@ -1188,7 +1022,7 @@
           <w:rFonts w:ascii="Consolas" w:hAnsi="Consolas" w:eastAsia="Consolas"/>
           <w:sz w:val="17"/>
         </w:rPr>
-        <w:t xml:space="preserve">        lr = LogisticRegression().fit(X, y)</w:t>
+        <w:t>"""</w:t>
       </w:r>
     </w:p>
     <w:p>
@@ -1201,7 +1035,7 @@
           <w:rFonts w:ascii="Consolas" w:hAnsi="Consolas" w:eastAsia="Consolas"/>
           <w:sz w:val="17"/>
         </w:rPr>
-        <w:t xml:space="preserve">        knn = KNeighborsClassifier(n_neighbors=5).fit(X, y)</w:t>
+        <w:t>from sklearn.datasets import make_classification</w:t>
       </w:r>
     </w:p>
     <w:p>
@@ -1214,7 +1048,7 @@
           <w:rFonts w:ascii="Consolas" w:hAnsi="Consolas" w:eastAsia="Consolas"/>
           <w:sz w:val="17"/>
         </w:rPr>
-        <w:t xml:space="preserve">        tree = DecisionTreeClassifier(random_state=0).fit(X, y)</w:t>
+        <w:t>from sklearn.linear_model import LogisticRegression</w:t>
       </w:r>
     </w:p>
     <w:p>
@@ -1227,7 +1061,7 @@
           <w:rFonts w:ascii="Consolas" w:hAnsi="Consolas" w:eastAsia="Consolas"/>
           <w:sz w:val="17"/>
         </w:rPr>
-        <w:t xml:space="preserve">        n_lr = lr.coef_.size + lr.intercept_.size     # luon = d + 1, khong doi theo n</w:t>
+        <w:t>from sklearn.neighbors import KNeighborsClassifier</w:t>
       </w:r>
     </w:p>
     <w:p>
@@ -1240,7 +1074,7 @@
           <w:rFonts w:ascii="Consolas" w:hAnsi="Consolas" w:eastAsia="Consolas"/>
           <w:sz w:val="17"/>
         </w:rPr>
-        <w:t xml:space="preserve">        n_knn = knn._fit_X.size                        # KNN "nho" toan bo tap train</w:t>
+        <w:t>from sklearn.tree import DecisionTreeClassifier</w:t>
       </w:r>
     </w:p>
     <w:p>
@@ -1253,7 +1087,7 @@
           <w:rFonts w:ascii="Consolas" w:hAnsi="Consolas" w:eastAsia="Consolas"/>
           <w:sz w:val="17"/>
         </w:rPr>
-        <w:t xml:space="preserve">        print(f"{n:&gt;8} | {n_lr:&gt;18} | {n_knn:&gt;14} | {tree.tree_.node_count:&gt;12}")</w:t>
+        <w:t xml:space="preserve"> </w:t>
       </w:r>
     </w:p>
     <w:p>
@@ -1266,25 +1100,12 @@
           <w:rFonts w:ascii="Consolas" w:hAnsi="Consolas" w:eastAsia="Consolas"/>
           <w:sz w:val="17"/>
         </w:rPr>
-        <w:t xml:space="preserve">        assert n_lr == 6 and n_knn == n * 5</w:t>
-      </w:r>
-    </w:p>
-    <w:p>
-      <w:pPr>
-        <w:spacing w:after="40"/>
-      </w:pPr>
-    </w:p>
-    <w:p>
-      <w:r>
-        <w:rPr>
-          <w:b/>
-        </w:rPr>
-        <w:t>Kết quả chạy:</w:t>
-      </w:r>
-    </w:p>
-    <w:p>
-      <w:pPr>
-        <w:shd w:val="clear" w:color="auto" w:fill="E8F3EC"/>
+        <w:t>print(f"{'n_train':&gt;8} | {'LogReg (#tham so)':&gt;18} | {'KNN (#so luu)':&gt;14} | {'Tree (#node)':&gt;12}")</w:t>
+      </w:r>
+    </w:p>
+    <w:p>
+      <w:pPr>
+        <w:shd w:val="clear" w:color="auto" w:fill="F3F4F6"/>
         <w:spacing w:after="0" w:before="0" w:line="240" w:lineRule="auto"/>
       </w:pPr>
       <w:r>
@@ -1292,7 +1113,124 @@
           <w:rFonts w:ascii="Consolas" w:hAnsi="Consolas" w:eastAsia="Consolas"/>
           <w:sz w:val="17"/>
         </w:rPr>
-        <w:t>=== CAU 1: Parametric vs Non-parametric ===</w:t>
+        <w:t>for n in [100, 1000, 10000]:</w:t>
+      </w:r>
+    </w:p>
+    <w:p>
+      <w:pPr>
+        <w:shd w:val="clear" w:color="auto" w:fill="F3F4F6"/>
+        <w:spacing w:after="0" w:before="0" w:line="240" w:lineRule="auto"/>
+      </w:pPr>
+      <w:r>
+        <w:rPr>
+          <w:rFonts w:ascii="Consolas" w:hAnsi="Consolas" w:eastAsia="Consolas"/>
+          <w:sz w:val="17"/>
+        </w:rPr>
+        <w:t xml:space="preserve">    X, y = make_classification(n_samples=n, n_features=5, random_state=0)</w:t>
+      </w:r>
+    </w:p>
+    <w:p>
+      <w:pPr>
+        <w:shd w:val="clear" w:color="auto" w:fill="F3F4F6"/>
+        <w:spacing w:after="0" w:before="0" w:line="240" w:lineRule="auto"/>
+      </w:pPr>
+      <w:r>
+        <w:rPr>
+          <w:rFonts w:ascii="Consolas" w:hAnsi="Consolas" w:eastAsia="Consolas"/>
+          <w:sz w:val="17"/>
+        </w:rPr>
+        <w:t xml:space="preserve">    lr = LogisticRegression().fit(X, y)</w:t>
+      </w:r>
+    </w:p>
+    <w:p>
+      <w:pPr>
+        <w:shd w:val="clear" w:color="auto" w:fill="F3F4F6"/>
+        <w:spacing w:after="0" w:before="0" w:line="240" w:lineRule="auto"/>
+      </w:pPr>
+      <w:r>
+        <w:rPr>
+          <w:rFonts w:ascii="Consolas" w:hAnsi="Consolas" w:eastAsia="Consolas"/>
+          <w:sz w:val="17"/>
+        </w:rPr>
+        <w:t xml:space="preserve">    knn = KNeighborsClassifier(n_neighbors=5).fit(X, y)</w:t>
+      </w:r>
+    </w:p>
+    <w:p>
+      <w:pPr>
+        <w:shd w:val="clear" w:color="auto" w:fill="F3F4F6"/>
+        <w:spacing w:after="0" w:before="0" w:line="240" w:lineRule="auto"/>
+      </w:pPr>
+      <w:r>
+        <w:rPr>
+          <w:rFonts w:ascii="Consolas" w:hAnsi="Consolas" w:eastAsia="Consolas"/>
+          <w:sz w:val="17"/>
+        </w:rPr>
+        <w:t xml:space="preserve">    tree = DecisionTreeClassifier(random_state=0).fit(X, y)</w:t>
+      </w:r>
+    </w:p>
+    <w:p>
+      <w:pPr>
+        <w:shd w:val="clear" w:color="auto" w:fill="F3F4F6"/>
+        <w:spacing w:after="0" w:before="0" w:line="240" w:lineRule="auto"/>
+      </w:pPr>
+      <w:r>
+        <w:rPr>
+          <w:rFonts w:ascii="Consolas" w:hAnsi="Consolas" w:eastAsia="Consolas"/>
+          <w:sz w:val="17"/>
+        </w:rPr>
+        <w:t xml:space="preserve">    n_lr = lr.coef_.size + lr.intercept_.size     # luon = d + 1, khong doi theo n</w:t>
+      </w:r>
+    </w:p>
+    <w:p>
+      <w:pPr>
+        <w:shd w:val="clear" w:color="auto" w:fill="F3F4F6"/>
+        <w:spacing w:after="0" w:before="0" w:line="240" w:lineRule="auto"/>
+      </w:pPr>
+      <w:r>
+        <w:rPr>
+          <w:rFonts w:ascii="Consolas" w:hAnsi="Consolas" w:eastAsia="Consolas"/>
+          <w:sz w:val="17"/>
+        </w:rPr>
+        <w:t xml:space="preserve">    n_knn = knn._fit_X.size                        # KNN "nho" toan bo tap train</w:t>
+      </w:r>
+    </w:p>
+    <w:p>
+      <w:pPr>
+        <w:shd w:val="clear" w:color="auto" w:fill="F3F4F6"/>
+        <w:spacing w:after="0" w:before="0" w:line="240" w:lineRule="auto"/>
+      </w:pPr>
+      <w:r>
+        <w:rPr>
+          <w:rFonts w:ascii="Consolas" w:hAnsi="Consolas" w:eastAsia="Consolas"/>
+          <w:sz w:val="17"/>
+        </w:rPr>
+        <w:t xml:space="preserve">    print(f"{n:&gt;8} | {n_lr:&gt;18} | {n_knn:&gt;14} | {tree.tree_.node_count:&gt;12}")</w:t>
+      </w:r>
+    </w:p>
+    <w:p>
+      <w:pPr>
+        <w:shd w:val="clear" w:color="auto" w:fill="F3F4F6"/>
+        <w:spacing w:after="0" w:before="0" w:line="240" w:lineRule="auto"/>
+      </w:pPr>
+      <w:r>
+        <w:rPr>
+          <w:rFonts w:ascii="Consolas" w:hAnsi="Consolas" w:eastAsia="Consolas"/>
+          <w:sz w:val="17"/>
+        </w:rPr>
+        <w:t xml:space="preserve">    assert n_lr == 6 and n_knn == n * 5</w:t>
+      </w:r>
+    </w:p>
+    <w:p>
+      <w:pPr>
+        <w:spacing w:after="40"/>
+      </w:pPr>
+    </w:p>
+    <w:p>
+      <w:r>
+        <w:rPr>
+          <w:b/>
+        </w:rPr>
+        <w:t>Kết quả chạy:</w:t>
       </w:r>
     </w:p>
     <w:p>
@@ -2472,7 +2410,7 @@
         <w:pStyle w:val="Heading2"/>
       </w:pPr>
       <w:r>
-        <w:t>Code minh hoạ</w:t>
+        <w:t>Code minh hoạ: reports/code/cau2_generative.py</w:t>
       </w:r>
     </w:p>
     <w:p>
@@ -2485,7 +2423,7 @@
           <w:rFonts w:ascii="Consolas" w:hAnsi="Consolas" w:eastAsia="Consolas"/>
           <w:sz w:val="17"/>
         </w:rPr>
-        <w:t>def cau2_generative_vs_discriminative():</w:t>
+        <w:t>"""Cau 2. GENERATIVE sinh duoc du lieu moi, DISCRIMINATIVE thi khong.</w:t>
       </w:r>
     </w:p>
     <w:p>
@@ -2498,7 +2436,7 @@
           <w:rFonts w:ascii="Consolas" w:hAnsi="Consolas" w:eastAsia="Consolas"/>
           <w:sz w:val="17"/>
         </w:rPr>
-        <w:t xml:space="preserve">    print("\n=== CAU 2: Generative sinh du lieu, Discriminative thi khong ===")</w:t>
+        <w:t xml:space="preserve"> </w:t>
       </w:r>
     </w:p>
     <w:p>
@@ -2511,7 +2449,7 @@
           <w:rFonts w:ascii="Consolas" w:hAnsi="Consolas" w:eastAsia="Consolas"/>
           <w:sz w:val="17"/>
         </w:rPr>
-        <w:t xml:space="preserve">    X_dog = np.array([[200, 200, 50, 50],</w:t>
+        <w:t>Vi du Cat &amp; Dog 2x2 trong slide 13-15 (ML-04-CLASSIFICATION).</w:t>
       </w:r>
     </w:p>
     <w:p>
@@ -2524,7 +2462,7 @@
           <w:rFonts w:ascii="Consolas" w:hAnsi="Consolas" w:eastAsia="Consolas"/>
           <w:sz w:val="17"/>
         </w:rPr>
-        <w:t xml:space="preserve">                      [210, 190, 40, 60]], dtype=float)</w:t>
+        <w:t>Chay: python reports/code/cau2_generative.py</w:t>
       </w:r>
     </w:p>
     <w:p>
@@ -2537,7 +2475,7 @@
           <w:rFonts w:ascii="Consolas" w:hAnsi="Consolas" w:eastAsia="Consolas"/>
           <w:sz w:val="17"/>
         </w:rPr>
-        <w:t xml:space="preserve"> </w:t>
+        <w:t>"""</w:t>
       </w:r>
     </w:p>
     <w:p>
@@ -2550,7 +2488,7 @@
           <w:rFonts w:ascii="Consolas" w:hAnsi="Consolas" w:eastAsia="Consolas"/>
           <w:sz w:val="17"/>
         </w:rPr>
-        <w:t xml:space="preserve">    # Generative: hoc P(X | Dog) ~ N(mu, sigma^2) cho tung pixel</w:t>
+        <w:t>import numpy as np</w:t>
       </w:r>
     </w:p>
     <w:p>
@@ -2563,7 +2501,7 @@
           <w:rFonts w:ascii="Consolas" w:hAnsi="Consolas" w:eastAsia="Consolas"/>
           <w:sz w:val="17"/>
         </w:rPr>
-        <w:t xml:space="preserve">    mu, sigma = X_dog.mean(axis=0), X_dog.std(axis=0)</w:t>
+        <w:t>from sklearn.datasets import make_classification</w:t>
       </w:r>
     </w:p>
     <w:p>
@@ -2576,7 +2514,7 @@
           <w:rFonts w:ascii="Consolas" w:hAnsi="Consolas" w:eastAsia="Consolas"/>
           <w:sz w:val="17"/>
         </w:rPr>
-        <w:t xml:space="preserve">    z = np.array([0.8, -1.2, 0.4, 0.2])                # z ~ N(0,1) nhu slide</w:t>
+        <w:t>from sklearn.linear_model import LogisticRegression</w:t>
       </w:r>
     </w:p>
     <w:p>
@@ -2589,7 +2527,7 @@
           <w:rFonts w:ascii="Consolas" w:hAnsi="Consolas" w:eastAsia="Consolas"/>
           <w:sz w:val="17"/>
         </w:rPr>
-        <w:t xml:space="preserve">    x_new = mu + sigma * z</w:t>
+        <w:t>from sklearn.naive_bayes import GaussianNB</w:t>
       </w:r>
     </w:p>
     <w:p>
@@ -2602,7 +2540,7 @@
           <w:rFonts w:ascii="Consolas" w:hAnsi="Consolas" w:eastAsia="Consolas"/>
           <w:sz w:val="17"/>
         </w:rPr>
-        <w:t xml:space="preserve">    print("mu =", mu, " sigma =", sigma)</w:t>
+        <w:t xml:space="preserve"> </w:t>
       </w:r>
     </w:p>
     <w:p>
@@ -2615,7 +2553,7 @@
           <w:rFonts w:ascii="Consolas" w:hAnsi="Consolas" w:eastAsia="Consolas"/>
           <w:sz w:val="17"/>
         </w:rPr>
-        <w:t xml:space="preserve">    print("Anh cho moi sinh ra:", x_new.round())       # [209 189 47 56]</w:t>
+        <w:t>rng = np.random.default_rng(0)</w:t>
       </w:r>
     </w:p>
     <w:p>
@@ -2628,7 +2566,7 @@
           <w:rFonts w:ascii="Consolas" w:hAnsi="Consolas" w:eastAsia="Consolas"/>
           <w:sz w:val="17"/>
         </w:rPr>
-        <w:t xml:space="preserve">    assert np.allclose(x_new.round(), [209, 189, 47, 56])</w:t>
+        <w:t xml:space="preserve"> </w:t>
       </w:r>
     </w:p>
     <w:p>
@@ -2641,7 +2579,7 @@
           <w:rFonts w:ascii="Consolas" w:hAnsi="Consolas" w:eastAsia="Consolas"/>
           <w:sz w:val="17"/>
         </w:rPr>
-        <w:t xml:space="preserve"> </w:t>
+        <w:t>X_dog = np.array([[200, 200, 50, 50],</w:t>
       </w:r>
     </w:p>
     <w:p>
@@ -2654,7 +2592,7 @@
           <w:rFonts w:ascii="Consolas" w:hAnsi="Consolas" w:eastAsia="Consolas"/>
           <w:sz w:val="17"/>
         </w:rPr>
-        <w:t xml:space="preserve">    # Discriminative (Logistic Regression): chi co ranh gioi w.x + b</w:t>
+        <w:t xml:space="preserve">                  [210, 190, 40, 60]], dtype=float)</w:t>
       </w:r>
     </w:p>
     <w:p>
@@ -2667,7 +2605,7 @@
           <w:rFonts w:ascii="Consolas" w:hAnsi="Consolas" w:eastAsia="Consolas"/>
           <w:sz w:val="17"/>
         </w:rPr>
-        <w:t xml:space="preserve">    w, b = np.array([-1, -1, 1, 1]), 0</w:t>
+        <w:t xml:space="preserve"> </w:t>
       </w:r>
     </w:p>
     <w:p>
@@ -2680,7 +2618,7 @@
           <w:rFonts w:ascii="Consolas" w:hAnsi="Consolas" w:eastAsia="Consolas"/>
           <w:sz w:val="17"/>
         </w:rPr>
-        <w:t xml:space="preserve">    sigmoid = lambda t: 1 / (1 + np.exp(-t))</w:t>
+        <w:t># Generative: hoc P(X | Dog) ~ N(mu, sigma^2) cho tung pixel</w:t>
       </w:r>
     </w:p>
     <w:p>
@@ -2693,7 +2631,7 @@
           <w:rFonts w:ascii="Consolas" w:hAnsi="Consolas" w:eastAsia="Consolas"/>
           <w:sz w:val="17"/>
         </w:rPr>
-        <w:t xml:space="preserve">    for x in ([0, 0, 255, 255], [-100, -100, 0, 0]):</w:t>
+        <w:t>mu, sigma = X_dog.mean(axis=0), X_dog.std(axis=0)</w:t>
       </w:r>
     </w:p>
     <w:p>
@@ -2706,7 +2644,7 @@
           <w:rFonts w:ascii="Consolas" w:hAnsi="Consolas" w:eastAsia="Consolas"/>
           <w:sz w:val="17"/>
         </w:rPr>
-        <w:t xml:space="preserve">        x = np.asarray(x, float)</w:t>
+        <w:t>z = np.array([0.8, -1.2, 0.4, 0.2])                # z ~ N(0,1) nhu slide</w:t>
       </w:r>
     </w:p>
     <w:p>
@@ -2719,7 +2657,7 @@
           <w:rFonts w:ascii="Consolas" w:hAnsi="Consolas" w:eastAsia="Consolas"/>
           <w:sz w:val="17"/>
         </w:rPr>
-        <w:t xml:space="preserve">        print(f"x={x}  w.x+b={w @ x + b:&gt;6.0f}  P(Dog|x)={sigmoid(w @ x + b):.3f}")</w:t>
+        <w:t>x_new = mu + sigma * z</w:t>
       </w:r>
     </w:p>
     <w:p>
@@ -2732,7 +2670,7 @@
           <w:rFonts w:ascii="Consolas" w:hAnsi="Consolas" w:eastAsia="Consolas"/>
           <w:sz w:val="17"/>
         </w:rPr>
-        <w:t xml:space="preserve">    # Ca 2 anh vo nghia deu duoc goi la "Dog": w chi cho biet x nam ben nao cua ranh gioi,</w:t>
+        <w:t>print("mu =", mu, " sigma =", sigma)</w:t>
       </w:r>
     </w:p>
     <w:p>
@@ -2745,7 +2683,7 @@
           <w:rFonts w:ascii="Consolas" w:hAnsi="Consolas" w:eastAsia="Consolas"/>
           <w:sz w:val="17"/>
         </w:rPr>
-        <w:t xml:space="preserve">    # khong cho biet P(x) nen khong co gi de lay mau.</w:t>
+        <w:t>print("Anh cho moi sinh ra:", x_new.round())       # [209 189 47 56]</w:t>
       </w:r>
     </w:p>
     <w:p>
@@ -2758,7 +2696,7 @@
           <w:rFonts w:ascii="Consolas" w:hAnsi="Consolas" w:eastAsia="Consolas"/>
           <w:sz w:val="17"/>
         </w:rPr>
-        <w:t xml:space="preserve"> </w:t>
+        <w:t>assert np.allclose(x_new.round(), [209, 189, 47, 56])</w:t>
       </w:r>
     </w:p>
     <w:p>
@@ -2771,7 +2709,7 @@
           <w:rFonts w:ascii="Consolas" w:hAnsi="Consolas" w:eastAsia="Consolas"/>
           <w:sz w:val="17"/>
         </w:rPr>
-        <w:t xml:space="preserve">    # Voi sklearn: GaussianNB (generative) luu theta_, var_ -&gt; lay mau duoc</w:t>
+        <w:t xml:space="preserve"> </w:t>
       </w:r>
     </w:p>
     <w:p>
@@ -2784,7 +2722,7 @@
           <w:rFonts w:ascii="Consolas" w:hAnsi="Consolas" w:eastAsia="Consolas"/>
           <w:sz w:val="17"/>
         </w:rPr>
-        <w:t xml:space="preserve">    X, y = make_classification(n_samples=500, n_features=4, n_informative=4,</w:t>
+        <w:t># Discriminative (Logistic Regression): chi co ranh gioi w.x + b</w:t>
       </w:r>
     </w:p>
     <w:p>
@@ -2797,7 +2735,7 @@
           <w:rFonts w:ascii="Consolas" w:hAnsi="Consolas" w:eastAsia="Consolas"/>
           <w:sz w:val="17"/>
         </w:rPr>
-        <w:t xml:space="preserve">                               n_redundant=0, random_state=1)</w:t>
+        <w:t>w, b = np.array([-1, -1, 1, 1]), 0</w:t>
       </w:r>
     </w:p>
     <w:p>
@@ -2810,7 +2748,7 @@
           <w:rFonts w:ascii="Consolas" w:hAnsi="Consolas" w:eastAsia="Consolas"/>
           <w:sz w:val="17"/>
         </w:rPr>
-        <w:t xml:space="preserve">    nb = GaussianNB().fit(X, y)</w:t>
+        <w:t>sigmoid = lambda t: 1 / (1 + np.exp(-t))</w:t>
       </w:r>
     </w:p>
     <w:p>
@@ -2823,7 +2761,7 @@
           <w:rFonts w:ascii="Consolas" w:hAnsi="Consolas" w:eastAsia="Consolas"/>
           <w:sz w:val="17"/>
         </w:rPr>
-        <w:t xml:space="preserve">    fake = rng.normal(nb.theta_[1], np.sqrt(nb.var_[1]), size=(5, 4))</w:t>
+        <w:t>for x in ([0, 0, 255, 255], [-100, -100, 0, 0]):</w:t>
       </w:r>
     </w:p>
     <w:p>
@@ -2836,7 +2774,7 @@
           <w:rFonts w:ascii="Consolas" w:hAnsi="Consolas" w:eastAsia="Consolas"/>
           <w:sz w:val="17"/>
         </w:rPr>
-        <w:t xml:space="preserve">    print("GaussianNB sinh 5 mau lop 1 -&gt;", nb.predict(fake))</w:t>
+        <w:t xml:space="preserve">    x = np.asarray(x, float)</w:t>
       </w:r>
     </w:p>
     <w:p>
@@ -2849,7 +2787,7 @@
           <w:rFonts w:ascii="Consolas" w:hAnsi="Consolas" w:eastAsia="Consolas"/>
           <w:sz w:val="17"/>
         </w:rPr>
-        <w:t xml:space="preserve">    lr = LogisticRegression().fit(X, y)</w:t>
+        <w:t xml:space="preserve">    print(f"x={x}  w.x+b={w @ x + b:&gt;6.0f}  P(Dog|x)={sigmoid(w @ x + b):.3f}")</w:t>
       </w:r>
     </w:p>
     <w:p>
@@ -2862,25 +2800,12 @@
           <w:rFonts w:ascii="Consolas" w:hAnsi="Consolas" w:eastAsia="Consolas"/>
           <w:sz w:val="17"/>
         </w:rPr>
-        <w:t xml:space="preserve">    print("LogReg chi co coef_ =", lr.coef_.round(2), "-&gt; khong co phan bo de lay mau")</w:t>
-      </w:r>
-    </w:p>
-    <w:p>
-      <w:pPr>
-        <w:spacing w:after="40"/>
-      </w:pPr>
-    </w:p>
-    <w:p>
-      <w:r>
-        <w:rPr>
-          <w:b/>
-        </w:rPr>
-        <w:t>Kết quả chạy:</w:t>
-      </w:r>
-    </w:p>
-    <w:p>
-      <w:pPr>
-        <w:shd w:val="clear" w:color="auto" w:fill="E8F3EC"/>
+        <w:t># Ca 2 anh vo nghia deu duoc goi la "Dog": w chi cho biet x nam ben nao cua ranh gioi,</w:t>
+      </w:r>
+    </w:p>
+    <w:p>
+      <w:pPr>
+        <w:shd w:val="clear" w:color="auto" w:fill="F3F4F6"/>
         <w:spacing w:after="0" w:before="0" w:line="240" w:lineRule="auto"/>
       </w:pPr>
       <w:r>
@@ -2888,7 +2813,137 @@
           <w:rFonts w:ascii="Consolas" w:hAnsi="Consolas" w:eastAsia="Consolas"/>
           <w:sz w:val="17"/>
         </w:rPr>
-        <w:t>=== CAU 2: Generative sinh du lieu, Discriminative thi khong ===</w:t>
+        <w:t># khong cho biet P(x) nen khong co gi de lay mau.</w:t>
+      </w:r>
+    </w:p>
+    <w:p>
+      <w:pPr>
+        <w:shd w:val="clear" w:color="auto" w:fill="F3F4F6"/>
+        <w:spacing w:after="0" w:before="0" w:line="240" w:lineRule="auto"/>
+      </w:pPr>
+      <w:r>
+        <w:rPr>
+          <w:rFonts w:ascii="Consolas" w:hAnsi="Consolas" w:eastAsia="Consolas"/>
+          <w:sz w:val="17"/>
+        </w:rPr>
+        <w:t xml:space="preserve"> </w:t>
+      </w:r>
+    </w:p>
+    <w:p>
+      <w:pPr>
+        <w:shd w:val="clear" w:color="auto" w:fill="F3F4F6"/>
+        <w:spacing w:after="0" w:before="0" w:line="240" w:lineRule="auto"/>
+      </w:pPr>
+      <w:r>
+        <w:rPr>
+          <w:rFonts w:ascii="Consolas" w:hAnsi="Consolas" w:eastAsia="Consolas"/>
+          <w:sz w:val="17"/>
+        </w:rPr>
+        <w:t># Voi sklearn: GaussianNB (generative) luu theta_, var_ -&gt; lay mau duoc</w:t>
+      </w:r>
+    </w:p>
+    <w:p>
+      <w:pPr>
+        <w:shd w:val="clear" w:color="auto" w:fill="F3F4F6"/>
+        <w:spacing w:after="0" w:before="0" w:line="240" w:lineRule="auto"/>
+      </w:pPr>
+      <w:r>
+        <w:rPr>
+          <w:rFonts w:ascii="Consolas" w:hAnsi="Consolas" w:eastAsia="Consolas"/>
+          <w:sz w:val="17"/>
+        </w:rPr>
+        <w:t>X, y = make_classification(n_samples=500, n_features=4, n_informative=4,</w:t>
+      </w:r>
+    </w:p>
+    <w:p>
+      <w:pPr>
+        <w:shd w:val="clear" w:color="auto" w:fill="F3F4F6"/>
+        <w:spacing w:after="0" w:before="0" w:line="240" w:lineRule="auto"/>
+      </w:pPr>
+      <w:r>
+        <w:rPr>
+          <w:rFonts w:ascii="Consolas" w:hAnsi="Consolas" w:eastAsia="Consolas"/>
+          <w:sz w:val="17"/>
+        </w:rPr>
+        <w:t xml:space="preserve">                           n_redundant=0, random_state=1)</w:t>
+      </w:r>
+    </w:p>
+    <w:p>
+      <w:pPr>
+        <w:shd w:val="clear" w:color="auto" w:fill="F3F4F6"/>
+        <w:spacing w:after="0" w:before="0" w:line="240" w:lineRule="auto"/>
+      </w:pPr>
+      <w:r>
+        <w:rPr>
+          <w:rFonts w:ascii="Consolas" w:hAnsi="Consolas" w:eastAsia="Consolas"/>
+          <w:sz w:val="17"/>
+        </w:rPr>
+        <w:t>nb = GaussianNB().fit(X, y)</w:t>
+      </w:r>
+    </w:p>
+    <w:p>
+      <w:pPr>
+        <w:shd w:val="clear" w:color="auto" w:fill="F3F4F6"/>
+        <w:spacing w:after="0" w:before="0" w:line="240" w:lineRule="auto"/>
+      </w:pPr>
+      <w:r>
+        <w:rPr>
+          <w:rFonts w:ascii="Consolas" w:hAnsi="Consolas" w:eastAsia="Consolas"/>
+          <w:sz w:val="17"/>
+        </w:rPr>
+        <w:t>fake = rng.normal(nb.theta_[1], np.sqrt(nb.var_[1]), size=(5, 4))</w:t>
+      </w:r>
+    </w:p>
+    <w:p>
+      <w:pPr>
+        <w:shd w:val="clear" w:color="auto" w:fill="F3F4F6"/>
+        <w:spacing w:after="0" w:before="0" w:line="240" w:lineRule="auto"/>
+      </w:pPr>
+      <w:r>
+        <w:rPr>
+          <w:rFonts w:ascii="Consolas" w:hAnsi="Consolas" w:eastAsia="Consolas"/>
+          <w:sz w:val="17"/>
+        </w:rPr>
+        <w:t>print("GaussianNB sinh 5 mau lop 1 -&gt;", nb.predict(fake))</w:t>
+      </w:r>
+    </w:p>
+    <w:p>
+      <w:pPr>
+        <w:shd w:val="clear" w:color="auto" w:fill="F3F4F6"/>
+        <w:spacing w:after="0" w:before="0" w:line="240" w:lineRule="auto"/>
+      </w:pPr>
+      <w:r>
+        <w:rPr>
+          <w:rFonts w:ascii="Consolas" w:hAnsi="Consolas" w:eastAsia="Consolas"/>
+          <w:sz w:val="17"/>
+        </w:rPr>
+        <w:t>lr = LogisticRegression().fit(X, y)</w:t>
+      </w:r>
+    </w:p>
+    <w:p>
+      <w:pPr>
+        <w:shd w:val="clear" w:color="auto" w:fill="F3F4F6"/>
+        <w:spacing w:after="0" w:before="0" w:line="240" w:lineRule="auto"/>
+      </w:pPr>
+      <w:r>
+        <w:rPr>
+          <w:rFonts w:ascii="Consolas" w:hAnsi="Consolas" w:eastAsia="Consolas"/>
+          <w:sz w:val="17"/>
+        </w:rPr>
+        <w:t>print("LogReg chi co coef_ =", lr.coef_.round(2), "-&gt; khong co phan bo de lay mau")</w:t>
+      </w:r>
+    </w:p>
+    <w:p>
+      <w:pPr>
+        <w:spacing w:after="40"/>
+      </w:pPr>
+    </w:p>
+    <w:p>
+      <w:r>
+        <w:rPr>
+          <w:b/>
+        </w:rPr>
+        <w:t>Kết quả chạy:</w:t>
       </w:r>
     </w:p>
     <w:p>
@@ -3277,7 +3332,7 @@
         <w:pStyle w:val="Heading2"/>
       </w:pPr>
       <w:r>
-        <w:t>Code minh hoạ</w:t>
+        <w:t>Code minh hoạ: reports/code/cau3_logistic.py</w:t>
       </w:r>
     </w:p>
     <w:p>
@@ -3290,7 +3345,7 @@
           <w:rFonts w:ascii="Consolas" w:hAnsi="Consolas" w:eastAsia="Consolas"/>
           <w:sz w:val="17"/>
         </w:rPr>
-        <w:t>def sigmoid(t):</w:t>
+        <w:t>"""Cau 3. LOGISTIC REGRESSION: hoi quy tren log-odds, dung de phan loai.</w:t>
       </w:r>
     </w:p>
     <w:p>
@@ -3303,7 +3358,7 @@
           <w:rFonts w:ascii="Consolas" w:hAnsi="Consolas" w:eastAsia="Consolas"/>
           <w:sz w:val="17"/>
         </w:rPr>
-        <w:t xml:space="preserve">    return 1 / (1 + np.exp(-t))</w:t>
+        <w:t xml:space="preserve"> </w:t>
       </w:r>
     </w:p>
     <w:p>
@@ -3316,7 +3371,7 @@
           <w:rFonts w:ascii="Consolas" w:hAnsi="Consolas" w:eastAsia="Consolas"/>
           <w:sz w:val="17"/>
         </w:rPr>
-        <w:t xml:space="preserve"> </w:t>
+        <w:t>Tu cai Newton-Raphson / IRLS (slide 24-26, ML-03) va doi chieu voi sklearn.</w:t>
       </w:r>
     </w:p>
     <w:p>
@@ -3329,7 +3384,7 @@
           <w:rFonts w:ascii="Consolas" w:hAnsi="Consolas" w:eastAsia="Consolas"/>
           <w:sz w:val="17"/>
         </w:rPr>
-        <w:t xml:space="preserve"> </w:t>
+        <w:t>Chay: python reports/code/cau3_logistic.py</w:t>
       </w:r>
     </w:p>
     <w:p>
@@ -3342,7 +3397,7 @@
           <w:rFonts w:ascii="Consolas" w:hAnsi="Consolas" w:eastAsia="Consolas"/>
           <w:sz w:val="17"/>
         </w:rPr>
-        <w:t>def logistic_newton_raphson(X, y, n_iter=25):</w:t>
+        <w:t>"""</w:t>
       </w:r>
     </w:p>
     <w:p>
@@ -3355,7 +3410,7 @@
           <w:rFonts w:ascii="Consolas" w:hAnsi="Consolas" w:eastAsia="Consolas"/>
           <w:sz w:val="17"/>
         </w:rPr>
-        <w:t xml:space="preserve">    """Uoc luong beta bang Newton-Raphson / IRLS (slide 24-26)."""</w:t>
+        <w:t>import numpy as np</w:t>
       </w:r>
     </w:p>
     <w:p>
@@ -3368,7 +3423,7 @@
           <w:rFonts w:ascii="Consolas" w:hAnsi="Consolas" w:eastAsia="Consolas"/>
           <w:sz w:val="17"/>
         </w:rPr>
-        <w:t xml:space="preserve">    X1 = np.c_[np.ones(len(X)), X]</w:t>
+        <w:t>from sklearn.datasets import make_classification</w:t>
       </w:r>
     </w:p>
     <w:p>
@@ -3381,7 +3436,7 @@
           <w:rFonts w:ascii="Consolas" w:hAnsi="Consolas" w:eastAsia="Consolas"/>
           <w:sz w:val="17"/>
         </w:rPr>
-        <w:t xml:space="preserve">    beta = np.zeros(X1.shape[1])</w:t>
+        <w:t>from sklearn.linear_model import LogisticRegression</w:t>
       </w:r>
     </w:p>
     <w:p>
@@ -3394,7 +3449,7 @@
           <w:rFonts w:ascii="Consolas" w:hAnsi="Consolas" w:eastAsia="Consolas"/>
           <w:sz w:val="17"/>
         </w:rPr>
-        <w:t xml:space="preserve">    for _ in range(n_iter):</w:t>
+        <w:t>from sklearn.metrics import accuracy_score</w:t>
       </w:r>
     </w:p>
     <w:p>
@@ -3407,7 +3462,7 @@
           <w:rFonts w:ascii="Consolas" w:hAnsi="Consolas" w:eastAsia="Consolas"/>
           <w:sz w:val="17"/>
         </w:rPr>
-        <w:t xml:space="preserve">        p = sigmoid(X1 @ beta)</w:t>
+        <w:t xml:space="preserve"> </w:t>
       </w:r>
     </w:p>
     <w:p>
@@ -3420,7 +3475,7 @@
           <w:rFonts w:ascii="Consolas" w:hAnsi="Consolas" w:eastAsia="Consolas"/>
           <w:sz w:val="17"/>
         </w:rPr>
-        <w:t xml:space="preserve">        W = p * (1 - p)</w:t>
+        <w:t xml:space="preserve"> </w:t>
       </w:r>
     </w:p>
     <w:p>
@@ -3433,7 +3488,7 @@
           <w:rFonts w:ascii="Consolas" w:hAnsi="Consolas" w:eastAsia="Consolas"/>
           <w:sz w:val="17"/>
         </w:rPr>
-        <w:t xml:space="preserve">        grad = X1.T @ (y - p)                    # score vector</w:t>
+        <w:t>def sigmoid(t):</w:t>
       </w:r>
     </w:p>
     <w:p>
@@ -3446,7 +3501,7 @@
           <w:rFonts w:ascii="Consolas" w:hAnsi="Consolas" w:eastAsia="Consolas"/>
           <w:sz w:val="17"/>
         </w:rPr>
-        <w:t xml:space="preserve">        H = -(X1.T * W) @ X1                     # Hessian</w:t>
+        <w:t xml:space="preserve">    return 1 / (1 + np.exp(-t))</w:t>
       </w:r>
     </w:p>
     <w:p>
@@ -3459,7 +3514,7 @@
           <w:rFonts w:ascii="Consolas" w:hAnsi="Consolas" w:eastAsia="Consolas"/>
           <w:sz w:val="17"/>
         </w:rPr>
-        <w:t xml:space="preserve">        beta = beta - np.linalg.solve(H, grad)</w:t>
+        <w:t xml:space="preserve"> </w:t>
       </w:r>
     </w:p>
     <w:p>
@@ -3472,7 +3527,7 @@
           <w:rFonts w:ascii="Consolas" w:hAnsi="Consolas" w:eastAsia="Consolas"/>
           <w:sz w:val="17"/>
         </w:rPr>
-        <w:t xml:space="preserve">    return beta</w:t>
+        <w:t xml:space="preserve"> </w:t>
       </w:r>
     </w:p>
     <w:p>
@@ -3485,7 +3540,7 @@
           <w:rFonts w:ascii="Consolas" w:hAnsi="Consolas" w:eastAsia="Consolas"/>
           <w:sz w:val="17"/>
         </w:rPr>
-        <w:t xml:space="preserve"> </w:t>
+        <w:t>def logistic_newton_raphson(X, y, n_iter=25):</w:t>
       </w:r>
     </w:p>
     <w:p>
@@ -3498,7 +3553,7 @@
           <w:rFonts w:ascii="Consolas" w:hAnsi="Consolas" w:eastAsia="Consolas"/>
           <w:sz w:val="17"/>
         </w:rPr>
-        <w:t xml:space="preserve"> </w:t>
+        <w:t xml:space="preserve">    """Uoc luong beta bang Newton-Raphson / IRLS."""</w:t>
       </w:r>
     </w:p>
     <w:p>
@@ -3511,7 +3566,7 @@
           <w:rFonts w:ascii="Consolas" w:hAnsi="Consolas" w:eastAsia="Consolas"/>
           <w:sz w:val="17"/>
         </w:rPr>
-        <w:t>def cau3_logistic_regression():</w:t>
+        <w:t xml:space="preserve">    X1 = np.c_[np.ones(len(X)), X]</w:t>
       </w:r>
     </w:p>
     <w:p>
@@ -3524,7 +3579,7 @@
           <w:rFonts w:ascii="Consolas" w:hAnsi="Consolas" w:eastAsia="Consolas"/>
           <w:sz w:val="17"/>
         </w:rPr>
-        <w:t xml:space="preserve">    print("\n=== CAU 3: Logistic Regression ===")</w:t>
+        <w:t xml:space="preserve">    beta = np.zeros(X1.shape[1])</w:t>
       </w:r>
     </w:p>
     <w:p>
@@ -3537,7 +3592,7 @@
           <w:rFonts w:ascii="Consolas" w:hAnsi="Consolas" w:eastAsia="Consolas"/>
           <w:sz w:val="17"/>
         </w:rPr>
-        <w:t xml:space="preserve">    X, y = make_classification(n_samples=400, n_features=2, n_redundant=0, random_state=2)</w:t>
+        <w:t xml:space="preserve">    for _ in range(n_iter):</w:t>
       </w:r>
     </w:p>
     <w:p>
@@ -3550,7 +3605,7 @@
           <w:rFonts w:ascii="Consolas" w:hAnsi="Consolas" w:eastAsia="Consolas"/>
           <w:sz w:val="17"/>
         </w:rPr>
-        <w:t xml:space="preserve">    beta = logistic_newton_raphson(X, y)</w:t>
+        <w:t xml:space="preserve">        p = sigmoid(X1 @ beta)</w:t>
       </w:r>
     </w:p>
     <w:p>
@@ -3563,7 +3618,7 @@
           <w:rFonts w:ascii="Consolas" w:hAnsi="Consolas" w:eastAsia="Consolas"/>
           <w:sz w:val="17"/>
         </w:rPr>
-        <w:t xml:space="preserve">    sk = LogisticRegression(C=1e10, max_iter=1000).fit(X, y)   # C lon = gan nhu khong regularize</w:t>
+        <w:t xml:space="preserve">        W = p * (1 - p)</w:t>
       </w:r>
     </w:p>
     <w:p>
@@ -3576,7 +3631,7 @@
           <w:rFonts w:ascii="Consolas" w:hAnsi="Consolas" w:eastAsia="Consolas"/>
           <w:sz w:val="17"/>
         </w:rPr>
-        <w:t xml:space="preserve">    print("beta Newton-Raphson:", beta.round(4))</w:t>
+        <w:t xml:space="preserve">        grad = X1.T @ (y - p)                    # score vector</w:t>
       </w:r>
     </w:p>
     <w:p>
@@ -3589,7 +3644,7 @@
           <w:rFonts w:ascii="Consolas" w:hAnsi="Consolas" w:eastAsia="Consolas"/>
           <w:sz w:val="17"/>
         </w:rPr>
-        <w:t xml:space="preserve">    print("beta sklearn       :", np.r_[sk.intercept_, sk.coef_[0]].round(4))</w:t>
+        <w:t xml:space="preserve">        H = -(X1.T * W) @ X1                     # Hessian</w:t>
       </w:r>
     </w:p>
     <w:p>
@@ -3602,7 +3657,7 @@
           <w:rFonts w:ascii="Consolas" w:hAnsi="Consolas" w:eastAsia="Consolas"/>
           <w:sz w:val="17"/>
         </w:rPr>
-        <w:t xml:space="preserve">    assert np.allclose(beta, np.r_[sk.intercept_, sk.coef_[0]], atol=1e-3)</w:t>
+        <w:t xml:space="preserve">        beta = beta - np.linalg.solve(H, grad)</w:t>
       </w:r>
     </w:p>
     <w:p>
@@ -3615,7 +3670,7 @@
           <w:rFonts w:ascii="Consolas" w:hAnsi="Consolas" w:eastAsia="Consolas"/>
           <w:sz w:val="17"/>
         </w:rPr>
-        <w:t xml:space="preserve"> </w:t>
+        <w:t xml:space="preserve">    return beta</w:t>
       </w:r>
     </w:p>
     <w:p>
@@ -3628,7 +3683,7 @@
           <w:rFonts w:ascii="Consolas" w:hAnsi="Consolas" w:eastAsia="Consolas"/>
           <w:sz w:val="17"/>
         </w:rPr>
-        <w:t xml:space="preserve">    # Phan "hoi quy": log-odds la ham TUYEN TINH cua x</w:t>
+        <w:t xml:space="preserve"> </w:t>
       </w:r>
     </w:p>
     <w:p>
@@ -3641,7 +3696,7 @@
           <w:rFonts w:ascii="Consolas" w:hAnsi="Consolas" w:eastAsia="Consolas"/>
           <w:sz w:val="17"/>
         </w:rPr>
-        <w:t xml:space="preserve">    p = sk.predict_proba(X)[:, 1]</w:t>
+        <w:t xml:space="preserve"> </w:t>
       </w:r>
     </w:p>
     <w:p>
@@ -3654,7 +3709,7 @@
           <w:rFonts w:ascii="Consolas" w:hAnsi="Consolas" w:eastAsia="Consolas"/>
           <w:sz w:val="17"/>
         </w:rPr>
-        <w:t xml:space="preserve">    log_odds = np.log(p / (1 - p))</w:t>
+        <w:t>X, y = make_classification(n_samples=400, n_features=2, n_redundant=0, random_state=2)</w:t>
       </w:r>
     </w:p>
     <w:p>
@@ -3667,7 +3722,7 @@
           <w:rFonts w:ascii="Consolas" w:hAnsi="Consolas" w:eastAsia="Consolas"/>
           <w:sz w:val="17"/>
         </w:rPr>
-        <w:t xml:space="preserve">    print("log(p/(1-p)) == b0 + b.x ?", np.allclose(log_odds, sk.decision_function(X)))</w:t>
+        <w:t>beta = logistic_newton_raphson(X, y)</w:t>
       </w:r>
     </w:p>
     <w:p>
@@ -3680,7 +3735,7 @@
           <w:rFonts w:ascii="Consolas" w:hAnsi="Consolas" w:eastAsia="Consolas"/>
           <w:sz w:val="17"/>
         </w:rPr>
-        <w:t xml:space="preserve">    # Phan "phan loai": dat nguong 0.5 len xac suat p</w:t>
+        <w:t>sk = LogisticRegression(C=1e10, max_iter=1000).fit(X, y)   # C lon = gan nhu khong regularize</w:t>
       </w:r>
     </w:p>
     <w:p>
@@ -3693,7 +3748,7 @@
           <w:rFonts w:ascii="Consolas" w:hAnsi="Consolas" w:eastAsia="Consolas"/>
           <w:sz w:val="17"/>
         </w:rPr>
-        <w:t xml:space="preserve">    y_hat = (p &gt;= 0.5).astype(int)</w:t>
+        <w:t>print("beta Newton-Raphson:", beta.round(4))</w:t>
       </w:r>
     </w:p>
     <w:p>
@@ -3706,7 +3761,7 @@
           <w:rFonts w:ascii="Consolas" w:hAnsi="Consolas" w:eastAsia="Consolas"/>
           <w:sz w:val="17"/>
         </w:rPr>
-        <w:t xml:space="preserve">    assert (y_hat == sk.predict(X)).all()</w:t>
+        <w:t>print("beta sklearn       :", np.r_[sk.intercept_, sk.coef_[0]].round(4))</w:t>
       </w:r>
     </w:p>
     <w:p>
@@ -3719,7 +3774,7 @@
           <w:rFonts w:ascii="Consolas" w:hAnsi="Consolas" w:eastAsia="Consolas"/>
           <w:sz w:val="17"/>
         </w:rPr>
-        <w:t xml:space="preserve">    print("Accuracy:", accuracy_score(y, y_hat))</w:t>
+        <w:t>assert np.allclose(beta, np.r_[sk.intercept_, sk.coef_[0]], atol=1e-3)</w:t>
       </w:r>
     </w:p>
     <w:p>
@@ -3745,7 +3800,7 @@
           <w:rFonts w:ascii="Consolas" w:hAnsi="Consolas" w:eastAsia="Consolas"/>
           <w:sz w:val="17"/>
         </w:rPr>
-        <w:t xml:space="preserve">    # Odds ratio vi du hut thuoc / ung thu (slide 16)</w:t>
+        <w:t># Phan "hoi quy": log-odds la ham TUYEN TINH cua x</w:t>
       </w:r>
     </w:p>
     <w:p>
@@ -3758,7 +3813,7 @@
           <w:rFonts w:ascii="Consolas" w:hAnsi="Consolas" w:eastAsia="Consolas"/>
           <w:sz w:val="17"/>
         </w:rPr>
-        <w:t xml:space="preserve">    odds_ratio = (647 / 2) / (622 / 27)</w:t>
+        <w:t>p = sk.predict_proba(X)[:, 1]</w:t>
       </w:r>
     </w:p>
     <w:p>
@@ -3771,7 +3826,7 @@
           <w:rFonts w:ascii="Consolas" w:hAnsi="Consolas" w:eastAsia="Consolas"/>
           <w:sz w:val="17"/>
         </w:rPr>
-        <w:t xml:space="preserve">    print(f"Odds ratio smoking = {odds_ratio:.1f}")</w:t>
+        <w:t>log_odds = np.log(p / (1 - p))</w:t>
       </w:r>
     </w:p>
     <w:p>
@@ -3784,25 +3839,12 @@
           <w:rFonts w:ascii="Consolas" w:hAnsi="Consolas" w:eastAsia="Consolas"/>
           <w:sz w:val="17"/>
         </w:rPr>
-        <w:t xml:space="preserve">    assert round(odds_ratio, 1) == 14.0</w:t>
-      </w:r>
-    </w:p>
-    <w:p>
-      <w:pPr>
-        <w:spacing w:after="40"/>
-      </w:pPr>
-    </w:p>
-    <w:p>
-      <w:r>
-        <w:rPr>
-          <w:b/>
-        </w:rPr>
-        <w:t>Kết quả chạy:</w:t>
-      </w:r>
-    </w:p>
-    <w:p>
-      <w:pPr>
-        <w:shd w:val="clear" w:color="auto" w:fill="E8F3EC"/>
+        <w:t>print("log(p/(1-p)) == b0 + b.x ?", np.allclose(log_odds, sk.decision_function(X)))</w:t>
+      </w:r>
+    </w:p>
+    <w:p>
+      <w:pPr>
+        <w:shd w:val="clear" w:color="auto" w:fill="F3F4F6"/>
         <w:spacing w:after="0" w:before="0" w:line="240" w:lineRule="auto"/>
       </w:pPr>
       <w:r>
@@ -3810,7 +3852,124 @@
           <w:rFonts w:ascii="Consolas" w:hAnsi="Consolas" w:eastAsia="Consolas"/>
           <w:sz w:val="17"/>
         </w:rPr>
-        <w:t>=== CAU 3: Logistic Regression ===</w:t>
+        <w:t># Phan "phan loai": dat nguong 0.5 len xac suat p</w:t>
+      </w:r>
+    </w:p>
+    <w:p>
+      <w:pPr>
+        <w:shd w:val="clear" w:color="auto" w:fill="F3F4F6"/>
+        <w:spacing w:after="0" w:before="0" w:line="240" w:lineRule="auto"/>
+      </w:pPr>
+      <w:r>
+        <w:rPr>
+          <w:rFonts w:ascii="Consolas" w:hAnsi="Consolas" w:eastAsia="Consolas"/>
+          <w:sz w:val="17"/>
+        </w:rPr>
+        <w:t>y_hat = (p &gt;= 0.5).astype(int)</w:t>
+      </w:r>
+    </w:p>
+    <w:p>
+      <w:pPr>
+        <w:shd w:val="clear" w:color="auto" w:fill="F3F4F6"/>
+        <w:spacing w:after="0" w:before="0" w:line="240" w:lineRule="auto"/>
+      </w:pPr>
+      <w:r>
+        <w:rPr>
+          <w:rFonts w:ascii="Consolas" w:hAnsi="Consolas" w:eastAsia="Consolas"/>
+          <w:sz w:val="17"/>
+        </w:rPr>
+        <w:t>assert (y_hat == sk.predict(X)).all()</w:t>
+      </w:r>
+    </w:p>
+    <w:p>
+      <w:pPr>
+        <w:shd w:val="clear" w:color="auto" w:fill="F3F4F6"/>
+        <w:spacing w:after="0" w:before="0" w:line="240" w:lineRule="auto"/>
+      </w:pPr>
+      <w:r>
+        <w:rPr>
+          <w:rFonts w:ascii="Consolas" w:hAnsi="Consolas" w:eastAsia="Consolas"/>
+          <w:sz w:val="17"/>
+        </w:rPr>
+        <w:t>print("Accuracy:", accuracy_score(y, y_hat))</w:t>
+      </w:r>
+    </w:p>
+    <w:p>
+      <w:pPr>
+        <w:shd w:val="clear" w:color="auto" w:fill="F3F4F6"/>
+        <w:spacing w:after="0" w:before="0" w:line="240" w:lineRule="auto"/>
+      </w:pPr>
+      <w:r>
+        <w:rPr>
+          <w:rFonts w:ascii="Consolas" w:hAnsi="Consolas" w:eastAsia="Consolas"/>
+          <w:sz w:val="17"/>
+        </w:rPr>
+        <w:t xml:space="preserve"> </w:t>
+      </w:r>
+    </w:p>
+    <w:p>
+      <w:pPr>
+        <w:shd w:val="clear" w:color="auto" w:fill="F3F4F6"/>
+        <w:spacing w:after="0" w:before="0" w:line="240" w:lineRule="auto"/>
+      </w:pPr>
+      <w:r>
+        <w:rPr>
+          <w:rFonts w:ascii="Consolas" w:hAnsi="Consolas" w:eastAsia="Consolas"/>
+          <w:sz w:val="17"/>
+        </w:rPr>
+        <w:t># Odds ratio vi du hut thuoc / ung thu (slide 16)</w:t>
+      </w:r>
+    </w:p>
+    <w:p>
+      <w:pPr>
+        <w:shd w:val="clear" w:color="auto" w:fill="F3F4F6"/>
+        <w:spacing w:after="0" w:before="0" w:line="240" w:lineRule="auto"/>
+      </w:pPr>
+      <w:r>
+        <w:rPr>
+          <w:rFonts w:ascii="Consolas" w:hAnsi="Consolas" w:eastAsia="Consolas"/>
+          <w:sz w:val="17"/>
+        </w:rPr>
+        <w:t>odds_ratio = (647 / 2) / (622 / 27)</w:t>
+      </w:r>
+    </w:p>
+    <w:p>
+      <w:pPr>
+        <w:shd w:val="clear" w:color="auto" w:fill="F3F4F6"/>
+        <w:spacing w:after="0" w:before="0" w:line="240" w:lineRule="auto"/>
+      </w:pPr>
+      <w:r>
+        <w:rPr>
+          <w:rFonts w:ascii="Consolas" w:hAnsi="Consolas" w:eastAsia="Consolas"/>
+          <w:sz w:val="17"/>
+        </w:rPr>
+        <w:t>print(f"Odds ratio smoking = {odds_ratio:.1f}")</w:t>
+      </w:r>
+    </w:p>
+    <w:p>
+      <w:pPr>
+        <w:shd w:val="clear" w:color="auto" w:fill="F3F4F6"/>
+        <w:spacing w:after="0" w:before="0" w:line="240" w:lineRule="auto"/>
+      </w:pPr>
+      <w:r>
+        <w:rPr>
+          <w:rFonts w:ascii="Consolas" w:hAnsi="Consolas" w:eastAsia="Consolas"/>
+          <w:sz w:val="17"/>
+        </w:rPr>
+        <w:t>assert round(odds_ratio, 1) == 14.0</w:t>
+      </w:r>
+    </w:p>
+    <w:p>
+      <w:pPr>
+        <w:spacing w:after="40"/>
+      </w:pPr>
+    </w:p>
+    <w:p>
+      <w:r>
+        <w:rPr>
+          <w:b/>
+        </w:rPr>
+        <w:t>Kết quả chạy:</w:t>
       </w:r>
     </w:p>
     <w:p>
@@ -5899,7 +6058,7 @@
         <w:pStyle w:val="Heading2"/>
       </w:pPr>
       <w:r>
-        <w:t>Code minh hoạ</w:t>
+        <w:t>Code minh hoạ: reports/code/cau4_losses.py</w:t>
       </w:r>
     </w:p>
     <w:p>
@@ -5912,7 +6071,7 @@
           <w:rFonts w:ascii="Consolas" w:hAnsi="Consolas" w:eastAsia="Consolas"/>
           <w:sz w:val="17"/>
         </w:rPr>
-        <w:t># --- Hoi quy ---</w:t>
+        <w:t>"""Cau 4. TAT CA CAC HAM LOSS (hoi quy, phan loai nhi phan/da lop, focal, regularization, cay).</w:t>
       </w:r>
     </w:p>
     <w:p>
@@ -5925,7 +6084,7 @@
           <w:rFonts w:ascii="Consolas" w:hAnsi="Consolas" w:eastAsia="Consolas"/>
           <w:sz w:val="17"/>
         </w:rPr>
-        <w:t>def mse(y, yh):  return np.mean((y - yh) ** 2)            # L2 / quadratic</w:t>
+        <w:t xml:space="preserve"> </w:t>
       </w:r>
     </w:p>
     <w:p>
@@ -5938,7 +6097,7 @@
           <w:rFonts w:ascii="Consolas" w:hAnsi="Consolas" w:eastAsia="Consolas"/>
           <w:sz w:val="17"/>
         </w:rPr>
-        <w:t>def rmse(y, yh): return np.sqrt(mse(y, yh))</w:t>
+        <w:t>Assert doi chieu voi vi du so trong slide 26-32 (ML-04) va slide 14-15 (ML-06).</w:t>
       </w:r>
     </w:p>
     <w:p>
@@ -5951,7 +6110,7 @@
           <w:rFonts w:ascii="Consolas" w:hAnsi="Consolas" w:eastAsia="Consolas"/>
           <w:sz w:val="17"/>
         </w:rPr>
-        <w:t>def mae(y, yh):  return np.mean(np.abs(y - yh))           # L1</w:t>
+        <w:t>Chay: python reports/code/cau4_losses.py</w:t>
       </w:r>
     </w:p>
     <w:p>
@@ -5964,7 +6123,7 @@
           <w:rFonts w:ascii="Consolas" w:hAnsi="Consolas" w:eastAsia="Consolas"/>
           <w:sz w:val="17"/>
         </w:rPr>
-        <w:t>def mbe(y, yh):  return np.mean(y - yh)                   # mean bias error (co dau)</w:t>
+        <w:t>"""</w:t>
       </w:r>
     </w:p>
     <w:p>
@@ -5977,7 +6136,7 @@
           <w:rFonts w:ascii="Consolas" w:hAnsi="Consolas" w:eastAsia="Consolas"/>
           <w:sz w:val="17"/>
         </w:rPr>
-        <w:t xml:space="preserve"> </w:t>
+        <w:t>import numpy as np</w:t>
       </w:r>
     </w:p>
     <w:p>
@@ -6003,7 +6162,7 @@
           <w:rFonts w:ascii="Consolas" w:hAnsi="Consolas" w:eastAsia="Consolas"/>
           <w:sz w:val="17"/>
         </w:rPr>
-        <w:t># --- Phan loai nhi phan, y in {-1, +1}, s = diem so cua mo hinh ---</w:t>
+        <w:t xml:space="preserve"> </w:t>
       </w:r>
     </w:p>
     <w:p>
@@ -6016,7 +6175,7 @@
           <w:rFonts w:ascii="Consolas" w:hAnsi="Consolas" w:eastAsia="Consolas"/>
           <w:sz w:val="17"/>
         </w:rPr>
-        <w:t>def perceptron_loss(y, s): return np.maximum(0, -y * s)</w:t>
+        <w:t># --- Hoi quy ---</w:t>
       </w:r>
     </w:p>
     <w:p>
@@ -6029,7 +6188,7 @@
           <w:rFonts w:ascii="Consolas" w:hAnsi="Consolas" w:eastAsia="Consolas"/>
           <w:sz w:val="17"/>
         </w:rPr>
-        <w:t>def hinge_loss(y, s):      return np.maximum(0, 1 - y * s)</w:t>
+        <w:t>def mse(y, yh):  return np.mean((y - yh) ** 2)            # L2 / quadratic</w:t>
       </w:r>
     </w:p>
     <w:p>
@@ -6042,7 +6201,7 @@
           <w:rFonts w:ascii="Consolas" w:hAnsi="Consolas" w:eastAsia="Consolas"/>
           <w:sz w:val="17"/>
         </w:rPr>
-        <w:t>def logistic_loss(y, s):   return np.log2(1 + np.exp(-y * s))</w:t>
+        <w:t>def rmse(y, yh): return np.sqrt(mse(y, yh))</w:t>
       </w:r>
     </w:p>
     <w:p>
@@ -6055,7 +6214,7 @@
           <w:rFonts w:ascii="Consolas" w:hAnsi="Consolas" w:eastAsia="Consolas"/>
           <w:sz w:val="17"/>
         </w:rPr>
-        <w:t xml:space="preserve"> </w:t>
+        <w:t>def mae(y, yh):  return np.mean(np.abs(y - yh))           # L1</w:t>
       </w:r>
     </w:p>
     <w:p>
@@ -6068,7 +6227,7 @@
           <w:rFonts w:ascii="Consolas" w:hAnsi="Consolas" w:eastAsia="Consolas"/>
           <w:sz w:val="17"/>
         </w:rPr>
-        <w:t xml:space="preserve"> </w:t>
+        <w:t>def mbe(y, yh):  return np.mean(y - yh)                   # mean bias error (co dau)</w:t>
       </w:r>
     </w:p>
     <w:p>
@@ -6081,7 +6240,7 @@
           <w:rFonts w:ascii="Consolas" w:hAnsi="Consolas" w:eastAsia="Consolas"/>
           <w:sz w:val="17"/>
         </w:rPr>
-        <w:t># --- Phan loai da lop ---</w:t>
+        <w:t xml:space="preserve"> </w:t>
       </w:r>
     </w:p>
     <w:p>
@@ -6094,7 +6253,7 @@
           <w:rFonts w:ascii="Consolas" w:hAnsi="Consolas" w:eastAsia="Consolas"/>
           <w:sz w:val="17"/>
         </w:rPr>
-        <w:t>def multiclass_hinge(scores, y, squared=False):</w:t>
+        <w:t xml:space="preserve"> </w:t>
       </w:r>
     </w:p>
     <w:p>
@@ -6107,7 +6266,7 @@
           <w:rFonts w:ascii="Consolas" w:hAnsi="Consolas" w:eastAsia="Consolas"/>
           <w:sz w:val="17"/>
         </w:rPr>
-        <w:t xml:space="preserve">    """scores: (n, C), y: chi so lop dung. L_i = sum_{j!=y} max(0, s_j - s_y + 1)."""</w:t>
+        <w:t># --- Phan loai nhi phan, y in {-1, +1}, s = diem so cua mo hinh ---</w:t>
       </w:r>
     </w:p>
     <w:p>
@@ -6120,7 +6279,7 @@
           <w:rFonts w:ascii="Consolas" w:hAnsi="Consolas" w:eastAsia="Consolas"/>
           <w:sz w:val="17"/>
         </w:rPr>
-        <w:t xml:space="preserve">    s_y = scores[np.arange(len(y)), y][:, None]</w:t>
+        <w:t>def perceptron_loss(y, s): return np.maximum(0, -y * s)</w:t>
       </w:r>
     </w:p>
     <w:p>
@@ -6133,7 +6292,7 @@
           <w:rFonts w:ascii="Consolas" w:hAnsi="Consolas" w:eastAsia="Consolas"/>
           <w:sz w:val="17"/>
         </w:rPr>
-        <w:t xml:space="preserve">    margins = np.maximum(0, scores - s_y + 1)</w:t>
+        <w:t>def hinge_loss(y, s):      return np.maximum(0, 1 - y * s)</w:t>
       </w:r>
     </w:p>
     <w:p>
@@ -6146,7 +6305,7 @@
           <w:rFonts w:ascii="Consolas" w:hAnsi="Consolas" w:eastAsia="Consolas"/>
           <w:sz w:val="17"/>
         </w:rPr>
-        <w:t xml:space="preserve">    margins[np.arange(len(y)), y] = 0</w:t>
+        <w:t>def logistic_loss(y, s):   return np.log2(1 + np.exp(-y * s))</w:t>
       </w:r>
     </w:p>
     <w:p>
@@ -6159,7 +6318,7 @@
           <w:rFonts w:ascii="Consolas" w:hAnsi="Consolas" w:eastAsia="Consolas"/>
           <w:sz w:val="17"/>
         </w:rPr>
-        <w:t xml:space="preserve">    if squared:</w:t>
+        <w:t xml:space="preserve"> </w:t>
       </w:r>
     </w:p>
     <w:p>
@@ -6172,7 +6331,7 @@
           <w:rFonts w:ascii="Consolas" w:hAnsi="Consolas" w:eastAsia="Consolas"/>
           <w:sz w:val="17"/>
         </w:rPr>
-        <w:t xml:space="preserve">        margins = margins ** 2</w:t>
+        <w:t xml:space="preserve"> </w:t>
       </w:r>
     </w:p>
     <w:p>
@@ -6185,7 +6344,7 @@
           <w:rFonts w:ascii="Consolas" w:hAnsi="Consolas" w:eastAsia="Consolas"/>
           <w:sz w:val="17"/>
         </w:rPr>
-        <w:t xml:space="preserve">    return margins.sum(axis=1)</w:t>
+        <w:t># --- Phan loai da lop ---</w:t>
       </w:r>
     </w:p>
     <w:p>
@@ -6198,7 +6357,7 @@
           <w:rFonts w:ascii="Consolas" w:hAnsi="Consolas" w:eastAsia="Consolas"/>
           <w:sz w:val="17"/>
         </w:rPr>
-        <w:t xml:space="preserve"> </w:t>
+        <w:t>def multiclass_hinge(scores, y, squared=False):</w:t>
       </w:r>
     </w:p>
     <w:p>
@@ -6211,7 +6370,7 @@
           <w:rFonts w:ascii="Consolas" w:hAnsi="Consolas" w:eastAsia="Consolas"/>
           <w:sz w:val="17"/>
         </w:rPr>
-        <w:t xml:space="preserve"> </w:t>
+        <w:t xml:space="preserve">    """scores: (n, C), y: chi so lop dung. L_i = sum_{j!=y} max(0, s_j - s_y + 1)."""</w:t>
       </w:r>
     </w:p>
     <w:p>
@@ -6224,7 +6383,7 @@
           <w:rFonts w:ascii="Consolas" w:hAnsi="Consolas" w:eastAsia="Consolas"/>
           <w:sz w:val="17"/>
         </w:rPr>
-        <w:t>def softmax(scores):</w:t>
+        <w:t xml:space="preserve">    s_y = scores[np.arange(len(y)), y][:, None]</w:t>
       </w:r>
     </w:p>
     <w:p>
@@ -6237,7 +6396,7 @@
           <w:rFonts w:ascii="Consolas" w:hAnsi="Consolas" w:eastAsia="Consolas"/>
           <w:sz w:val="17"/>
         </w:rPr>
-        <w:t xml:space="preserve">    e = np.exp(scores - scores.max(axis=1, keepdims=True))</w:t>
+        <w:t xml:space="preserve">    margins = np.maximum(0, scores - s_y + 1)</w:t>
       </w:r>
     </w:p>
     <w:p>
@@ -6250,7 +6409,7 @@
           <w:rFonts w:ascii="Consolas" w:hAnsi="Consolas" w:eastAsia="Consolas"/>
           <w:sz w:val="17"/>
         </w:rPr>
-        <w:t xml:space="preserve">    return e / e.sum(axis=1, keepdims=True)</w:t>
+        <w:t xml:space="preserve">    margins[np.arange(len(y)), y] = 0</w:t>
       </w:r>
     </w:p>
     <w:p>
@@ -6263,7 +6422,7 @@
           <w:rFonts w:ascii="Consolas" w:hAnsi="Consolas" w:eastAsia="Consolas"/>
           <w:sz w:val="17"/>
         </w:rPr>
-        <w:t xml:space="preserve"> </w:t>
+        <w:t xml:space="preserve">    if squared:</w:t>
       </w:r>
     </w:p>
     <w:p>
@@ -6276,7 +6435,7 @@
           <w:rFonts w:ascii="Consolas" w:hAnsi="Consolas" w:eastAsia="Consolas"/>
           <w:sz w:val="17"/>
         </w:rPr>
-        <w:t xml:space="preserve"> </w:t>
+        <w:t xml:space="preserve">        margins = margins ** 2</w:t>
       </w:r>
     </w:p>
     <w:p>
@@ -6289,7 +6448,7 @@
           <w:rFonts w:ascii="Consolas" w:hAnsi="Consolas" w:eastAsia="Consolas"/>
           <w:sz w:val="17"/>
         </w:rPr>
-        <w:t>def cross_entropy(scores, y):</w:t>
+        <w:t xml:space="preserve">    return margins.sum(axis=1)</w:t>
       </w:r>
     </w:p>
     <w:p>
@@ -6302,7 +6461,7 @@
           <w:rFonts w:ascii="Consolas" w:hAnsi="Consolas" w:eastAsia="Consolas"/>
           <w:sz w:val="17"/>
         </w:rPr>
-        <w:t xml:space="preserve">    return -np.log(softmax(scores)[np.arange(len(y)), y])</w:t>
+        <w:t xml:space="preserve"> </w:t>
       </w:r>
     </w:p>
     <w:p>
@@ -6328,7 +6487,7 @@
           <w:rFonts w:ascii="Consolas" w:hAnsi="Consolas" w:eastAsia="Consolas"/>
           <w:sz w:val="17"/>
         </w:rPr>
-        <w:t xml:space="preserve"> </w:t>
+        <w:t>def softmax(scores):</w:t>
       </w:r>
     </w:p>
     <w:p>
@@ -6341,7 +6500,7 @@
           <w:rFonts w:ascii="Consolas" w:hAnsi="Consolas" w:eastAsia="Consolas"/>
           <w:sz w:val="17"/>
         </w:rPr>
-        <w:t>def binary_cross_entropy(y, p):          # y in {0,1}</w:t>
+        <w:t xml:space="preserve">    e = np.exp(scores - scores.max(axis=1, keepdims=True))</w:t>
       </w:r>
     </w:p>
     <w:p>
@@ -6354,7 +6513,7 @@
           <w:rFonts w:ascii="Consolas" w:hAnsi="Consolas" w:eastAsia="Consolas"/>
           <w:sz w:val="17"/>
         </w:rPr>
-        <w:t xml:space="preserve">    return -(y * np.log(p) + (1 - y) * np.log(1 - p))</w:t>
+        <w:t xml:space="preserve">    return e / e.sum(axis=1, keepdims=True)</w:t>
       </w:r>
     </w:p>
     <w:p>
@@ -6393,7 +6552,7 @@
           <w:rFonts w:ascii="Consolas" w:hAnsi="Consolas" w:eastAsia="Consolas"/>
           <w:sz w:val="17"/>
         </w:rPr>
-        <w:t>def focal_loss(p_t, gamma=2.0, alpha_t=1.0):</w:t>
+        <w:t>def cross_entropy(scores, y):</w:t>
       </w:r>
     </w:p>
     <w:p>
@@ -6406,7 +6565,7 @@
           <w:rFonts w:ascii="Consolas" w:hAnsi="Consolas" w:eastAsia="Consolas"/>
           <w:sz w:val="17"/>
         </w:rPr>
-        <w:t xml:space="preserve">    return -alpha_t * (1 - p_t) ** gamma * np.log(p_t)</w:t>
+        <w:t xml:space="preserve">    return -np.log(softmax(scores)[np.arange(len(y)), y])</w:t>
       </w:r>
     </w:p>
     <w:p>
@@ -6445,7 +6604,7 @@
           <w:rFonts w:ascii="Consolas" w:hAnsi="Consolas" w:eastAsia="Consolas"/>
           <w:sz w:val="17"/>
         </w:rPr>
-        <w:t># --- Do do tap chat cua cay quyet dinh ---</w:t>
+        <w:t>def binary_cross_entropy(y, p):          # y in {0,1}</w:t>
       </w:r>
     </w:p>
     <w:p>
@@ -6458,7 +6617,7 @@
           <w:rFonts w:ascii="Consolas" w:hAnsi="Consolas" w:eastAsia="Consolas"/>
           <w:sz w:val="17"/>
         </w:rPr>
-        <w:t>def entropy(counts):</w:t>
+        <w:t xml:space="preserve">    return -(y * np.log(p) + (1 - y) * np.log(1 - p))</w:t>
       </w:r>
     </w:p>
     <w:p>
@@ -6471,7 +6630,7 @@
           <w:rFonts w:ascii="Consolas" w:hAnsi="Consolas" w:eastAsia="Consolas"/>
           <w:sz w:val="17"/>
         </w:rPr>
-        <w:t xml:space="preserve">    p = np.asarray(counts, float) / np.sum(counts)</w:t>
+        <w:t xml:space="preserve"> </w:t>
       </w:r>
     </w:p>
     <w:p>
@@ -6484,7 +6643,7 @@
           <w:rFonts w:ascii="Consolas" w:hAnsi="Consolas" w:eastAsia="Consolas"/>
           <w:sz w:val="17"/>
         </w:rPr>
-        <w:t xml:space="preserve">    p = p[p &gt; 0]</w:t>
+        <w:t xml:space="preserve"> </w:t>
       </w:r>
     </w:p>
     <w:p>
@@ -6497,7 +6656,7 @@
           <w:rFonts w:ascii="Consolas" w:hAnsi="Consolas" w:eastAsia="Consolas"/>
           <w:sz w:val="17"/>
         </w:rPr>
-        <w:t xml:space="preserve">    return -(p * np.log2(p)).sum()</w:t>
+        <w:t>def focal_loss(p_t, gamma=2.0, alpha_t=1.0):</w:t>
       </w:r>
     </w:p>
     <w:p>
@@ -6510,7 +6669,7 @@
           <w:rFonts w:ascii="Consolas" w:hAnsi="Consolas" w:eastAsia="Consolas"/>
           <w:sz w:val="17"/>
         </w:rPr>
-        <w:t xml:space="preserve"> </w:t>
+        <w:t xml:space="preserve">    return -alpha_t * (1 - p_t) ** gamma * np.log(p_t)</w:t>
       </w:r>
     </w:p>
     <w:p>
@@ -6536,7 +6695,7 @@
           <w:rFonts w:ascii="Consolas" w:hAnsi="Consolas" w:eastAsia="Consolas"/>
           <w:sz w:val="17"/>
         </w:rPr>
-        <w:t>def gini(counts):</w:t>
+        <w:t xml:space="preserve"> </w:t>
       </w:r>
     </w:p>
     <w:p>
@@ -6549,7 +6708,7 @@
           <w:rFonts w:ascii="Consolas" w:hAnsi="Consolas" w:eastAsia="Consolas"/>
           <w:sz w:val="17"/>
         </w:rPr>
-        <w:t xml:space="preserve">    p = np.asarray(counts, float) / np.sum(counts)</w:t>
+        <w:t># --- Do do tap chat cua cay quyet dinh ---</w:t>
       </w:r>
     </w:p>
     <w:p>
@@ -6562,7 +6721,7 @@
           <w:rFonts w:ascii="Consolas" w:hAnsi="Consolas" w:eastAsia="Consolas"/>
           <w:sz w:val="17"/>
         </w:rPr>
-        <w:t xml:space="preserve">    return 1 - (p ** 2).sum()</w:t>
+        <w:t>def entropy(counts):</w:t>
       </w:r>
     </w:p>
     <w:p>
@@ -6575,7 +6734,7 @@
           <w:rFonts w:ascii="Consolas" w:hAnsi="Consolas" w:eastAsia="Consolas"/>
           <w:sz w:val="17"/>
         </w:rPr>
-        <w:t xml:space="preserve"> </w:t>
+        <w:t xml:space="preserve">    p = np.asarray(counts, float) / np.sum(counts)</w:t>
       </w:r>
     </w:p>
     <w:p>
@@ -6588,7 +6747,7 @@
           <w:rFonts w:ascii="Consolas" w:hAnsi="Consolas" w:eastAsia="Consolas"/>
           <w:sz w:val="17"/>
         </w:rPr>
-        <w:t xml:space="preserve"> </w:t>
+        <w:t xml:space="preserve">    p = p[p &gt; 0]</w:t>
       </w:r>
     </w:p>
     <w:p>
@@ -6601,7 +6760,7 @@
           <w:rFonts w:ascii="Consolas" w:hAnsi="Consolas" w:eastAsia="Consolas"/>
           <w:sz w:val="17"/>
         </w:rPr>
-        <w:t>def cau4_losses():</w:t>
+        <w:t xml:space="preserve">    return -(p * np.log2(p)).sum()</w:t>
       </w:r>
     </w:p>
     <w:p>
@@ -6614,7 +6773,7 @@
           <w:rFonts w:ascii="Consolas" w:hAnsi="Consolas" w:eastAsia="Consolas"/>
           <w:sz w:val="17"/>
         </w:rPr>
-        <w:t xml:space="preserve">    print("\n=== CAU 4: Cac ham Loss ===")</w:t>
+        <w:t xml:space="preserve"> </w:t>
       </w:r>
     </w:p>
     <w:p>
@@ -6627,7 +6786,7 @@
           <w:rFonts w:ascii="Consolas" w:hAnsi="Consolas" w:eastAsia="Consolas"/>
           <w:sz w:val="17"/>
         </w:rPr>
-        <w:t xml:space="preserve">    y, yh = np.array([3.0, 5, 2.5, 7]), np.array([2.5, 5, 4, 8])</w:t>
+        <w:t xml:space="preserve"> </w:t>
       </w:r>
     </w:p>
     <w:p>
@@ -6640,7 +6799,7 @@
           <w:rFonts w:ascii="Consolas" w:hAnsi="Consolas" w:eastAsia="Consolas"/>
           <w:sz w:val="17"/>
         </w:rPr>
-        <w:t xml:space="preserve">    print(f"MSE={mse(y, yh):.4f} RMSE={rmse(y, yh):.4f} MAE={mae(y, yh):.4f} MBE={mbe(y, yh):.4f}")</w:t>
+        <w:t>def gini(counts):</w:t>
       </w:r>
     </w:p>
     <w:p>
@@ -6653,7 +6812,7 @@
           <w:rFonts w:ascii="Consolas" w:hAnsi="Consolas" w:eastAsia="Consolas"/>
           <w:sz w:val="17"/>
         </w:rPr>
-        <w:t xml:space="preserve"> </w:t>
+        <w:t xml:space="preserve">    p = np.asarray(counts, float) / np.sum(counts)</w:t>
       </w:r>
     </w:p>
     <w:p>
@@ -6666,7 +6825,7 @@
           <w:rFonts w:ascii="Consolas" w:hAnsi="Consolas" w:eastAsia="Consolas"/>
           <w:sz w:val="17"/>
         </w:rPr>
-        <w:t xml:space="preserve">    s = np.array([2.0, 0.5, -0.5, -2.0])           # y = +1 cho ca 4 mau</w:t>
+        <w:t xml:space="preserve">    return 1 - (p ** 2).sum()</w:t>
       </w:r>
     </w:p>
     <w:p>
@@ -6679,7 +6838,7 @@
           <w:rFonts w:ascii="Consolas" w:hAnsi="Consolas" w:eastAsia="Consolas"/>
           <w:sz w:val="17"/>
         </w:rPr>
-        <w:t xml:space="preserve">    print("y*s           :", s)</w:t>
+        <w:t xml:space="preserve"> </w:t>
       </w:r>
     </w:p>
     <w:p>
@@ -6692,7 +6851,7 @@
           <w:rFonts w:ascii="Consolas" w:hAnsi="Consolas" w:eastAsia="Consolas"/>
           <w:sz w:val="17"/>
         </w:rPr>
-        <w:t xml:space="preserve">    print("Perceptron    :", perceptron_loss(1, s))</w:t>
+        <w:t xml:space="preserve"> </w:t>
       </w:r>
     </w:p>
     <w:p>
@@ -6705,7 +6864,7 @@
           <w:rFonts w:ascii="Consolas" w:hAnsi="Consolas" w:eastAsia="Consolas"/>
           <w:sz w:val="17"/>
         </w:rPr>
-        <w:t xml:space="preserve">    print("Hinge         :", hinge_loss(1, s))</w:t>
+        <w:t>if __name__ == "__main__":</w:t>
       </w:r>
     </w:p>
     <w:p>
@@ -6718,7 +6877,7 @@
           <w:rFonts w:ascii="Consolas" w:hAnsi="Consolas" w:eastAsia="Consolas"/>
           <w:sz w:val="17"/>
         </w:rPr>
-        <w:t xml:space="preserve">    print("Logistic      :", logistic_loss(1, s).round(4))</w:t>
+        <w:t xml:space="preserve">    y, yh = np.array([3.0, 5, 2.5, 7]), np.array([2.5, 5, 4, 8])</w:t>
       </w:r>
     </w:p>
     <w:p>
@@ -6731,7 +6890,7 @@
           <w:rFonts w:ascii="Consolas" w:hAnsi="Consolas" w:eastAsia="Consolas"/>
           <w:sz w:val="17"/>
         </w:rPr>
-        <w:t xml:space="preserve"> </w:t>
+        <w:t xml:space="preserve">    print(f"MSE={mse(y, yh):.4f} RMSE={rmse(y, yh):.4f} MAE={mae(y, yh):.4f} MBE={mbe(y, yh):.4f}")</w:t>
       </w:r>
     </w:p>
     <w:p>
@@ -6744,7 +6903,7 @@
           <w:rFonts w:ascii="Consolas" w:hAnsi="Consolas" w:eastAsia="Consolas"/>
           <w:sz w:val="17"/>
         </w:rPr>
-        <w:t xml:space="preserve">    # Vi du hinge loss da lop slide 28 (cot = anh, hang = lop cat/car/frog)</w:t>
+        <w:t xml:space="preserve"> </w:t>
       </w:r>
     </w:p>
     <w:p>
@@ -6757,7 +6916,7 @@
           <w:rFonts w:ascii="Consolas" w:hAnsi="Consolas" w:eastAsia="Consolas"/>
           <w:sz w:val="17"/>
         </w:rPr>
-        <w:t xml:space="preserve">    scores = np.array([[-0.39, 1.49, 4.21],        # anh 1, lop dung o cot 0</w:t>
+        <w:t xml:space="preserve">    s = np.array([2.0, 0.5, -0.5, -2.0])           # y = +1 cho ca 4 mau</w:t>
       </w:r>
     </w:p>
     <w:p>
@@ -6770,7 +6929,7 @@
           <w:rFonts w:ascii="Consolas" w:hAnsi="Consolas" w:eastAsia="Consolas"/>
           <w:sz w:val="17"/>
         </w:rPr>
-        <w:t xml:space="preserve">                       [-4.61, 3.28, 1.46],        # anh 2, lop dung o cot 1</w:t>
+        <w:t xml:space="preserve">    print("y*s           :", s)</w:t>
       </w:r>
     </w:p>
     <w:p>
@@ -6783,7 +6942,7 @@
           <w:rFonts w:ascii="Consolas" w:hAnsi="Consolas" w:eastAsia="Consolas"/>
           <w:sz w:val="17"/>
         </w:rPr>
-        <w:t xml:space="preserve">                       [1.03, -2.37, -2.27]])      # anh 3, lop dung o cot 2</w:t>
+        <w:t xml:space="preserve">    print("Perceptron    :", perceptron_loss(1, s))</w:t>
       </w:r>
     </w:p>
     <w:p>
@@ -6796,7 +6955,7 @@
           <w:rFonts w:ascii="Consolas" w:hAnsi="Consolas" w:eastAsia="Consolas"/>
           <w:sz w:val="17"/>
         </w:rPr>
-        <w:t xml:space="preserve">    y_true = np.array([0, 1, 2])</w:t>
+        <w:t xml:space="preserve">    print("Hinge         :", hinge_loss(1, s))</w:t>
       </w:r>
     </w:p>
     <w:p>
@@ -6809,7 +6968,7 @@
           <w:rFonts w:ascii="Consolas" w:hAnsi="Consolas" w:eastAsia="Consolas"/>
           <w:sz w:val="17"/>
         </w:rPr>
-        <w:t xml:space="preserve">    L = multiclass_hinge(scores, y_true)</w:t>
+        <w:t xml:space="preserve">    print("Logistic      :", logistic_loss(1, s).round(4))</w:t>
       </w:r>
     </w:p>
     <w:p>
@@ -6822,7 +6981,7 @@
           <w:rFonts w:ascii="Consolas" w:hAnsi="Consolas" w:eastAsia="Consolas"/>
           <w:sz w:val="17"/>
         </w:rPr>
-        <w:t xml:space="preserve">    print("Multiclass hinge:", L.round(2), " mean =", L.mean().round(2))</w:t>
+        <w:t xml:space="preserve"> </w:t>
       </w:r>
     </w:p>
     <w:p>
@@ -6835,7 +6994,7 @@
           <w:rFonts w:ascii="Consolas" w:hAnsi="Consolas" w:eastAsia="Consolas"/>
           <w:sz w:val="17"/>
         </w:rPr>
-        <w:t xml:space="preserve">    assert np.allclose(L, [8.48, 0.0, 5.2], atol=0.01)</w:t>
+        <w:t xml:space="preserve">    # Vi du hinge loss da lop slide 28 (cot = lop, hang = anh)</w:t>
       </w:r>
     </w:p>
     <w:p>
@@ -6848,7 +7007,7 @@
           <w:rFonts w:ascii="Consolas" w:hAnsi="Consolas" w:eastAsia="Consolas"/>
           <w:sz w:val="17"/>
         </w:rPr>
-        <w:t xml:space="preserve">    print("Squared hinge   :", multiclass_hinge(scores, y_true, squared=True).round(2))</w:t>
+        <w:t xml:space="preserve">    scores = np.array([[-0.39, 1.49, 4.21],        # anh 1, lop dung o cot 0</w:t>
       </w:r>
     </w:p>
     <w:p>
@@ -6861,7 +7020,7 @@
           <w:rFonts w:ascii="Consolas" w:hAnsi="Consolas" w:eastAsia="Consolas"/>
           <w:sz w:val="17"/>
         </w:rPr>
-        <w:t xml:space="preserve">    print("Cross-entropy   :", cross_entropy(scores, y_true).round(4))</w:t>
+        <w:t xml:space="preserve">                       [-4.61, 3.28, 1.46],        # anh 2, lop dung o cot 1</w:t>
       </w:r>
     </w:p>
     <w:p>
@@ -6874,7 +7033,7 @@
           <w:rFonts w:ascii="Consolas" w:hAnsi="Consolas" w:eastAsia="Consolas"/>
           <w:sz w:val="17"/>
         </w:rPr>
-        <w:t xml:space="preserve">    print("Binary CE p=0.9,y=1:", binary_cross_entropy(1, 0.9).round(4))</w:t>
+        <w:t xml:space="preserve">                       [1.03, -2.37, -2.27]])      # anh 3, lop dung o cot 2</w:t>
       </w:r>
     </w:p>
     <w:p>
@@ -6887,7 +7046,7 @@
           <w:rFonts w:ascii="Consolas" w:hAnsi="Consolas" w:eastAsia="Consolas"/>
           <w:sz w:val="17"/>
         </w:rPr>
-        <w:t xml:space="preserve"> </w:t>
+        <w:t xml:space="preserve">    y_true = np.array([0, 1, 2])</w:t>
       </w:r>
     </w:p>
     <w:p>
@@ -6900,7 +7059,7 @@
           <w:rFonts w:ascii="Consolas" w:hAnsi="Consolas" w:eastAsia="Consolas"/>
           <w:sz w:val="17"/>
         </w:rPr>
-        <w:t xml:space="preserve">    # Focal loss (slide 32)</w:t>
+        <w:t xml:space="preserve">    L = multiclass_hinge(scores, y_true)</w:t>
       </w:r>
     </w:p>
     <w:p>
@@ -6913,7 +7072,7 @@
           <w:rFonts w:ascii="Consolas" w:hAnsi="Consolas" w:eastAsia="Consolas"/>
           <w:sz w:val="17"/>
         </w:rPr>
-        <w:t xml:space="preserve">    for q in (0.5, 0.9, 0.1):</w:t>
+        <w:t xml:space="preserve">    print("Multiclass hinge:", L.round(2), " mean =", L.mean().round(2))</w:t>
       </w:r>
     </w:p>
     <w:p>
@@ -6926,7 +7085,7 @@
           <w:rFonts w:ascii="Consolas" w:hAnsi="Consolas" w:eastAsia="Consolas"/>
           <w:sz w:val="17"/>
         </w:rPr>
-        <w:t xml:space="preserve">        print(f"q_dog={q}: CE={-np.log(q):.4f}  FL(gamma=2)={focal_loss(q):.5f}")</w:t>
+        <w:t xml:space="preserve">    assert np.allclose(L, [8.48, 0.0, 5.2], atol=0.01)</w:t>
       </w:r>
     </w:p>
     <w:p>
@@ -6939,7 +7098,7 @@
           <w:rFonts w:ascii="Consolas" w:hAnsi="Consolas" w:eastAsia="Consolas"/>
           <w:sz w:val="17"/>
         </w:rPr>
-        <w:t xml:space="preserve">    assert round(focal_loss(0.5), 3) == 0.173 and round(focal_loss(0.9), 5) == 0.00105</w:t>
+        <w:t xml:space="preserve">    print("Squared hinge   :", multiclass_hinge(scores, y_true, squared=True).round(2))</w:t>
       </w:r>
     </w:p>
     <w:p>
@@ -6952,7 +7111,7 @@
           <w:rFonts w:ascii="Consolas" w:hAnsi="Consolas" w:eastAsia="Consolas"/>
           <w:sz w:val="17"/>
         </w:rPr>
-        <w:t xml:space="preserve">    assert np.isclose(focal_loss(0.5, gamma=0), -np.log(0.5))   # gamma=0 -&gt; CE</w:t>
+        <w:t xml:space="preserve">    print("Cross-entropy   :", cross_entropy(scores, y_true).round(4))</w:t>
       </w:r>
     </w:p>
     <w:p>
@@ -6965,7 +7124,7 @@
           <w:rFonts w:ascii="Consolas" w:hAnsi="Consolas" w:eastAsia="Consolas"/>
           <w:sz w:val="17"/>
         </w:rPr>
-        <w:t xml:space="preserve"> </w:t>
+        <w:t xml:space="preserve">    print("Binary CE p=0.9,y=1:", binary_cross_entropy(1, 0.9).round(4))</w:t>
       </w:r>
     </w:p>
     <w:p>
@@ -6978,7 +7137,7 @@
           <w:rFonts w:ascii="Consolas" w:hAnsi="Consolas" w:eastAsia="Consolas"/>
           <w:sz w:val="17"/>
         </w:rPr>
-        <w:t xml:space="preserve">    # Entropy / Info gain / Gini (slide 14-15: Outlook tren weather data)</w:t>
+        <w:t xml:space="preserve"> </w:t>
       </w:r>
     </w:p>
     <w:p>
@@ -6991,7 +7150,7 @@
           <w:rFonts w:ascii="Consolas" w:hAnsi="Consolas" w:eastAsia="Consolas"/>
           <w:sz w:val="17"/>
         </w:rPr>
-        <w:t xml:space="preserve">    e_play = entropy([9, 5])</w:t>
+        <w:t xml:space="preserve">    # Focal loss (slide 32)</w:t>
       </w:r>
     </w:p>
     <w:p>
@@ -7004,7 +7163,7 @@
           <w:rFonts w:ascii="Consolas" w:hAnsi="Consolas" w:eastAsia="Consolas"/>
           <w:sz w:val="17"/>
         </w:rPr>
-        <w:t xml:space="preserve">    e_outlook = 5 / 14 * entropy([3, 2]) + 4 / 14 * entropy([4, 0]) + 5 / 14 * entropy([2, 3])</w:t>
+        <w:t xml:space="preserve">    for q in (0.5, 0.9, 0.1):</w:t>
       </w:r>
     </w:p>
     <w:p>
@@ -7017,7 +7176,7 @@
           <w:rFonts w:ascii="Consolas" w:hAnsi="Consolas" w:eastAsia="Consolas"/>
           <w:sz w:val="17"/>
         </w:rPr>
-        <w:t xml:space="preserve">    print(f"Entropy(Play)={e_play:.3f}  Entropy(Outlook)={e_outlook:.3f}  "</w:t>
+        <w:t xml:space="preserve">        print(f"q_dog={q}: CE={-np.log(q):.4f}  FL(gamma=2)={focal_loss(q):.5f}")</w:t>
       </w:r>
     </w:p>
     <w:p>
@@ -7030,7 +7189,7 @@
           <w:rFonts w:ascii="Consolas" w:hAnsi="Consolas" w:eastAsia="Consolas"/>
           <w:sz w:val="17"/>
         </w:rPr>
-        <w:t xml:space="preserve">          f"Gain={e_play - e_outlook:.3f}  Gini(sunny)={gini([3, 2]):.2f}")</w:t>
+        <w:t xml:space="preserve">    assert round(focal_loss(0.5), 3) == 0.173 and round(focal_loss(0.9), 5) == 0.00105</w:t>
       </w:r>
     </w:p>
     <w:p>
@@ -7043,7 +7202,7 @@
           <w:rFonts w:ascii="Consolas" w:hAnsi="Consolas" w:eastAsia="Consolas"/>
           <w:sz w:val="17"/>
         </w:rPr>
-        <w:t xml:space="preserve">    assert round(e_play, 2) == 0.94 and abs(e_outlook - 0.693) &lt; 1e-3</w:t>
+        <w:t xml:space="preserve">    assert np.isclose(focal_loss(0.5, gamma=0), -np.log(0.5))   # gamma=0 -&gt; CE</w:t>
       </w:r>
     </w:p>
     <w:p>
@@ -7069,7 +7228,7 @@
           <w:rFonts w:ascii="Consolas" w:hAnsi="Consolas" w:eastAsia="Consolas"/>
           <w:sz w:val="17"/>
         </w:rPr>
-        <w:t xml:space="preserve">    # Regularization L1/L2 (slide 33-36)</w:t>
+        <w:t xml:space="preserve">    # Entropy / Info gain / Gini (slide 14-15 ML-06: Outlook tren weather data)</w:t>
       </w:r>
     </w:p>
     <w:p>
@@ -7082,7 +7241,7 @@
           <w:rFonts w:ascii="Consolas" w:hAnsi="Consolas" w:eastAsia="Consolas"/>
           <w:sz w:val="17"/>
         </w:rPr>
-        <w:t xml:space="preserve">    w, lam, base = np.array([0.5, -2.0, 0.0, 3.0]), 0.1, 1.0</w:t>
+        <w:t xml:space="preserve">    e_play = entropy([9, 5])</w:t>
       </w:r>
     </w:p>
     <w:p>
@@ -7095,25 +7254,12 @@
           <w:rFonts w:ascii="Consolas" w:hAnsi="Consolas" w:eastAsia="Consolas"/>
           <w:sz w:val="17"/>
         </w:rPr>
-        <w:t xml:space="preserve">    print(f"Loss + L1 = {base + lam * np.abs(w).sum():.3f}   Loss + L2 = {base + lam * (w ** 2).sum():.3f}")</w:t>
-      </w:r>
-    </w:p>
-    <w:p>
-      <w:pPr>
-        <w:spacing w:after="40"/>
-      </w:pPr>
-    </w:p>
-    <w:p>
-      <w:r>
-        <w:rPr>
-          <w:b/>
-        </w:rPr>
-        <w:t>Kết quả chạy:</w:t>
-      </w:r>
-    </w:p>
-    <w:p>
-      <w:pPr>
-        <w:shd w:val="clear" w:color="auto" w:fill="E8F3EC"/>
+        <w:t xml:space="preserve">    e_outlook = 5 / 14 * entropy([3, 2]) + 4 / 14 * entropy([4, 0]) + 5 / 14 * entropy([2, 3])</w:t>
+      </w:r>
+    </w:p>
+    <w:p>
+      <w:pPr>
+        <w:shd w:val="clear" w:color="auto" w:fill="F3F4F6"/>
         <w:spacing w:after="0" w:before="0" w:line="240" w:lineRule="auto"/>
       </w:pPr>
       <w:r>
@@ -7121,7 +7267,98 @@
           <w:rFonts w:ascii="Consolas" w:hAnsi="Consolas" w:eastAsia="Consolas"/>
           <w:sz w:val="17"/>
         </w:rPr>
-        <w:t>=== CAU 4: Cac ham Loss ===</w:t>
+        <w:t xml:space="preserve">    print(f"Entropy(Play)={e_play:.3f}  Entropy(Outlook)={e_outlook:.3f}  "</w:t>
+      </w:r>
+    </w:p>
+    <w:p>
+      <w:pPr>
+        <w:shd w:val="clear" w:color="auto" w:fill="F3F4F6"/>
+        <w:spacing w:after="0" w:before="0" w:line="240" w:lineRule="auto"/>
+      </w:pPr>
+      <w:r>
+        <w:rPr>
+          <w:rFonts w:ascii="Consolas" w:hAnsi="Consolas" w:eastAsia="Consolas"/>
+          <w:sz w:val="17"/>
+        </w:rPr>
+        <w:t xml:space="preserve">          f"Gain={e_play - e_outlook:.3f}  Gini(sunny)={gini([3, 2]):.2f}")</w:t>
+      </w:r>
+    </w:p>
+    <w:p>
+      <w:pPr>
+        <w:shd w:val="clear" w:color="auto" w:fill="F3F4F6"/>
+        <w:spacing w:after="0" w:before="0" w:line="240" w:lineRule="auto"/>
+      </w:pPr>
+      <w:r>
+        <w:rPr>
+          <w:rFonts w:ascii="Consolas" w:hAnsi="Consolas" w:eastAsia="Consolas"/>
+          <w:sz w:val="17"/>
+        </w:rPr>
+        <w:t xml:space="preserve">    assert round(e_play, 2) == 0.94 and abs(e_outlook - 0.693) &lt; 1e-3</w:t>
+      </w:r>
+    </w:p>
+    <w:p>
+      <w:pPr>
+        <w:shd w:val="clear" w:color="auto" w:fill="F3F4F6"/>
+        <w:spacing w:after="0" w:before="0" w:line="240" w:lineRule="auto"/>
+      </w:pPr>
+      <w:r>
+        <w:rPr>
+          <w:rFonts w:ascii="Consolas" w:hAnsi="Consolas" w:eastAsia="Consolas"/>
+          <w:sz w:val="17"/>
+        </w:rPr>
+        <w:t xml:space="preserve"> </w:t>
+      </w:r>
+    </w:p>
+    <w:p>
+      <w:pPr>
+        <w:shd w:val="clear" w:color="auto" w:fill="F3F4F6"/>
+        <w:spacing w:after="0" w:before="0" w:line="240" w:lineRule="auto"/>
+      </w:pPr>
+      <w:r>
+        <w:rPr>
+          <w:rFonts w:ascii="Consolas" w:hAnsi="Consolas" w:eastAsia="Consolas"/>
+          <w:sz w:val="17"/>
+        </w:rPr>
+        <w:t xml:space="preserve">    # Regularization L1/L2 (slide 33-36)</w:t>
+      </w:r>
+    </w:p>
+    <w:p>
+      <w:pPr>
+        <w:shd w:val="clear" w:color="auto" w:fill="F3F4F6"/>
+        <w:spacing w:after="0" w:before="0" w:line="240" w:lineRule="auto"/>
+      </w:pPr>
+      <w:r>
+        <w:rPr>
+          <w:rFonts w:ascii="Consolas" w:hAnsi="Consolas" w:eastAsia="Consolas"/>
+          <w:sz w:val="17"/>
+        </w:rPr>
+        <w:t xml:space="preserve">    w, lam, base = np.array([0.5, -2.0, 0.0, 3.0]), 0.1, 1.0</w:t>
+      </w:r>
+    </w:p>
+    <w:p>
+      <w:pPr>
+        <w:shd w:val="clear" w:color="auto" w:fill="F3F4F6"/>
+        <w:spacing w:after="0" w:before="0" w:line="240" w:lineRule="auto"/>
+      </w:pPr>
+      <w:r>
+        <w:rPr>
+          <w:rFonts w:ascii="Consolas" w:hAnsi="Consolas" w:eastAsia="Consolas"/>
+          <w:sz w:val="17"/>
+        </w:rPr>
+        <w:t xml:space="preserve">    print(f"Loss + L1 = {base + lam * np.abs(w).sum():.3f}   Loss + L2 = {base + lam * (w ** 2).sum():.3f}")</w:t>
+      </w:r>
+    </w:p>
+    <w:p>
+      <w:pPr>
+        <w:spacing w:after="40"/>
+      </w:pPr>
+    </w:p>
+    <w:p>
+      <w:r>
+        <w:rPr>
+          <w:b/>
+        </w:rPr>
+        <w:t>Kết quả chạy:</w:t>
       </w:r>
     </w:p>
     <w:p>
@@ -8718,7 +8955,7 @@
         <w:pStyle w:val="Heading2"/>
       </w:pPr>
       <w:r>
-        <w:t>Code minh hoạ</w:t>
+        <w:t>Code minh hoạ: reports/code/cau5_metrics.py</w:t>
       </w:r>
     </w:p>
     <w:p>
@@ -8731,7 +8968,7 @@
           <w:rFonts w:ascii="Consolas" w:hAnsi="Consolas" w:eastAsia="Consolas"/>
           <w:sz w:val="17"/>
         </w:rPr>
-        <w:t>def metrics_from_cm(tp, fp, tn, fn):</w:t>
+        <w:t>"""Cau 5. CAC DO DO HIEU SUAT: ACC, Precision, Recall/Sensitivity, Specificity, F1, ROC, AUC.</w:t>
       </w:r>
     </w:p>
     <w:p>
@@ -8744,7 +8981,7 @@
           <w:rFonts w:ascii="Consolas" w:hAnsi="Consolas" w:eastAsia="Consolas"/>
           <w:sz w:val="17"/>
         </w:rPr>
-        <w:t xml:space="preserve">    acc = (tp + tn) / (tp + tn + fp + fn)</w:t>
+        <w:t xml:space="preserve"> </w:t>
       </w:r>
     </w:p>
     <w:p>
@@ -8757,7 +8994,7 @@
           <w:rFonts w:ascii="Consolas" w:hAnsi="Consolas" w:eastAsia="Consolas"/>
           <w:sz w:val="17"/>
         </w:rPr>
-        <w:t xml:space="preserve">    precision = tp / (tp + fp)</w:t>
+        <w:t>Vi du u ac tinh (slide 20, ML-04) + ROC/AUC cua 3 mo hinh.</w:t>
       </w:r>
     </w:p>
     <w:p>
@@ -8770,7 +9007,7 @@
           <w:rFonts w:ascii="Consolas" w:hAnsi="Consolas" w:eastAsia="Consolas"/>
           <w:sz w:val="17"/>
         </w:rPr>
-        <w:t xml:space="preserve">    recall = tp / (tp + fn)                 # = sensitivity = TPR</w:t>
+        <w:t>Chay: python reports/code/cau5_metrics.py [roc.png]   (tham so tuy chon: luu do thi ROC)</w:t>
       </w:r>
     </w:p>
     <w:p>
@@ -8783,7 +9020,7 @@
           <w:rFonts w:ascii="Consolas" w:hAnsi="Consolas" w:eastAsia="Consolas"/>
           <w:sz w:val="17"/>
         </w:rPr>
-        <w:t xml:space="preserve">    specificity = tn / (tn + fp)            # = TNR = 1 - FPR</w:t>
+        <w:t>"""</w:t>
       </w:r>
     </w:p>
     <w:p>
@@ -8796,7 +9033,7 @@
           <w:rFonts w:ascii="Consolas" w:hAnsi="Consolas" w:eastAsia="Consolas"/>
           <w:sz w:val="17"/>
         </w:rPr>
-        <w:t xml:space="preserve">    f1 = 2 * precision * recall / (precision + recall)</w:t>
+        <w:t>import sys</w:t>
       </w:r>
     </w:p>
     <w:p>
@@ -8809,7 +9046,7 @@
           <w:rFonts w:ascii="Consolas" w:hAnsi="Consolas" w:eastAsia="Consolas"/>
           <w:sz w:val="17"/>
         </w:rPr>
-        <w:t xml:space="preserve">    return dict(acc=acc, precision=precision, recall=recall, specificity=specificity, f1=f1)</w:t>
+        <w:t xml:space="preserve"> </w:t>
       </w:r>
     </w:p>
     <w:p>
@@ -8822,7 +9059,7 @@
           <w:rFonts w:ascii="Consolas" w:hAnsi="Consolas" w:eastAsia="Consolas"/>
           <w:sz w:val="17"/>
         </w:rPr>
-        <w:t xml:space="preserve"> </w:t>
+        <w:t>import numpy as np</w:t>
       </w:r>
     </w:p>
     <w:p>
@@ -8835,7 +9072,7 @@
           <w:rFonts w:ascii="Consolas" w:hAnsi="Consolas" w:eastAsia="Consolas"/>
           <w:sz w:val="17"/>
         </w:rPr>
-        <w:t xml:space="preserve"> </w:t>
+        <w:t>from sklearn.datasets import make_classification</w:t>
       </w:r>
     </w:p>
     <w:p>
@@ -8848,7 +9085,7 @@
           <w:rFonts w:ascii="Consolas" w:hAnsi="Consolas" w:eastAsia="Consolas"/>
           <w:sz w:val="17"/>
         </w:rPr>
-        <w:t>def auc_trapezoid(fpr, tpr):</w:t>
+        <w:t>from sklearn.linear_model import LogisticRegression</w:t>
       </w:r>
     </w:p>
     <w:p>
@@ -8861,7 +9098,7 @@
           <w:rFonts w:ascii="Consolas" w:hAnsi="Consolas" w:eastAsia="Consolas"/>
           <w:sz w:val="17"/>
         </w:rPr>
-        <w:t xml:space="preserve">    return float(np.sum(np.diff(fpr) * (tpr[1:] + tpr[:-1]) / 2))</w:t>
+        <w:t>from sklearn.metrics import (accuracy_score, confusion_matrix, f1_score, precision_score,</w:t>
       </w:r>
     </w:p>
     <w:p>
@@ -8874,7 +9111,7 @@
           <w:rFonts w:ascii="Consolas" w:hAnsi="Consolas" w:eastAsia="Consolas"/>
           <w:sz w:val="17"/>
         </w:rPr>
-        <w:t xml:space="preserve"> </w:t>
+        <w:t xml:space="preserve">                             recall_score, roc_auc_score, roc_curve)</w:t>
       </w:r>
     </w:p>
     <w:p>
@@ -8887,7 +9124,7 @@
           <w:rFonts w:ascii="Consolas" w:hAnsi="Consolas" w:eastAsia="Consolas"/>
           <w:sz w:val="17"/>
         </w:rPr>
-        <w:t xml:space="preserve"> </w:t>
+        <w:t>from sklearn.model_selection import train_test_split</w:t>
       </w:r>
     </w:p>
     <w:p>
@@ -8900,7 +9137,7 @@
           <w:rFonts w:ascii="Consolas" w:hAnsi="Consolas" w:eastAsia="Consolas"/>
           <w:sz w:val="17"/>
         </w:rPr>
-        <w:t>def cau5_metrics(save_plot=None):</w:t>
+        <w:t>from sklearn.naive_bayes import GaussianNB</w:t>
       </w:r>
     </w:p>
     <w:p>
@@ -8913,7 +9150,7 @@
           <w:rFonts w:ascii="Consolas" w:hAnsi="Consolas" w:eastAsia="Consolas"/>
           <w:sz w:val="17"/>
         </w:rPr>
-        <w:t xml:space="preserve">    print("\n=== CAU 5: Do do hieu suat ===")</w:t>
+        <w:t>from sklearn.neighbors import KNeighborsClassifier</w:t>
       </w:r>
     </w:p>
     <w:p>
@@ -8926,7 +9163,7 @@
           <w:rFonts w:ascii="Consolas" w:hAnsi="Consolas" w:eastAsia="Consolas"/>
           <w:sz w:val="17"/>
         </w:rPr>
-        <w:t xml:space="preserve">    # Vi du u ac tinh (slide 20)</w:t>
+        <w:t xml:space="preserve"> </w:t>
       </w:r>
     </w:p>
     <w:p>
@@ -8939,7 +9176,7 @@
           <w:rFonts w:ascii="Consolas" w:hAnsi="Consolas" w:eastAsia="Consolas"/>
           <w:sz w:val="17"/>
         </w:rPr>
-        <w:t xml:space="preserve">    m = metrics_from_cm(tp=1, fp=1, tn=90, fn=8)</w:t>
+        <w:t xml:space="preserve"> </w:t>
       </w:r>
     </w:p>
     <w:p>
@@ -8952,7 +9189,7 @@
           <w:rFonts w:ascii="Consolas" w:hAnsi="Consolas" w:eastAsia="Consolas"/>
           <w:sz w:val="17"/>
         </w:rPr>
-        <w:t xml:space="preserve">    print({k: round(v, 3) for k, v in m.items()})</w:t>
+        <w:t>def metrics_from_cm(tp, fp, tn, fn):</w:t>
       </w:r>
     </w:p>
     <w:p>
@@ -8965,7 +9202,7 @@
           <w:rFonts w:ascii="Consolas" w:hAnsi="Consolas" w:eastAsia="Consolas"/>
           <w:sz w:val="17"/>
         </w:rPr>
-        <w:t xml:space="preserve">    assert round(m["acc"], 2) == 0.91 and m["precision"] == 0.5 and round(m["recall"], 2) == 0.11</w:t>
+        <w:t xml:space="preserve">    acc = (tp + tn) / (tp + tn + fp + fn)</w:t>
       </w:r>
     </w:p>
     <w:p>
@@ -8978,7 +9215,7 @@
           <w:rFonts w:ascii="Consolas" w:hAnsi="Consolas" w:eastAsia="Consolas"/>
           <w:sz w:val="17"/>
         </w:rPr>
-        <w:t xml:space="preserve"> </w:t>
+        <w:t xml:space="preserve">    precision = tp / (tp + fp)</w:t>
       </w:r>
     </w:p>
     <w:p>
@@ -8991,7 +9228,7 @@
           <w:rFonts w:ascii="Consolas" w:hAnsi="Consolas" w:eastAsia="Consolas"/>
           <w:sz w:val="17"/>
         </w:rPr>
-        <w:t xml:space="preserve">    # Doi chieu voi sklearn</w:t>
+        <w:t xml:space="preserve">    recall = tp / (tp + fn)                 # = sensitivity = TPR</w:t>
       </w:r>
     </w:p>
     <w:p>
@@ -9004,7 +9241,7 @@
           <w:rFonts w:ascii="Consolas" w:hAnsi="Consolas" w:eastAsia="Consolas"/>
           <w:sz w:val="17"/>
         </w:rPr>
-        <w:t xml:space="preserve">    y_true = np.array([1] * 9 + [0] * 91)</w:t>
+        <w:t xml:space="preserve">    specificity = tn / (tn + fp)            # = TNR = 1 - FPR</w:t>
       </w:r>
     </w:p>
     <w:p>
@@ -9017,7 +9254,7 @@
           <w:rFonts w:ascii="Consolas" w:hAnsi="Consolas" w:eastAsia="Consolas"/>
           <w:sz w:val="17"/>
         </w:rPr>
-        <w:t xml:space="preserve">    y_pred = np.array([1] + [0] * 8 + [1] + [0] * 90)</w:t>
+        <w:t xml:space="preserve">    f1 = 2 * precision * recall / (precision + recall)</w:t>
       </w:r>
     </w:p>
     <w:p>
@@ -9030,7 +9267,7 @@
           <w:rFonts w:ascii="Consolas" w:hAnsi="Consolas" w:eastAsia="Consolas"/>
           <w:sz w:val="17"/>
         </w:rPr>
-        <w:t xml:space="preserve">    tn, fp, fn, tp = confusion_matrix(y_true, y_pred).ravel()</w:t>
+        <w:t xml:space="preserve">    return dict(acc=acc, precision=precision, recall=recall, specificity=specificity, f1=f1)</w:t>
       </w:r>
     </w:p>
     <w:p>
@@ -9043,7 +9280,7 @@
           <w:rFonts w:ascii="Consolas" w:hAnsi="Consolas" w:eastAsia="Consolas"/>
           <w:sz w:val="17"/>
         </w:rPr>
-        <w:t xml:space="preserve">    assert (tp, fp, tn, fn) == (1, 1, 90, 8)</w:t>
+        <w:t xml:space="preserve"> </w:t>
       </w:r>
     </w:p>
     <w:p>
@@ -9056,7 +9293,7 @@
           <w:rFonts w:ascii="Consolas" w:hAnsi="Consolas" w:eastAsia="Consolas"/>
           <w:sz w:val="17"/>
         </w:rPr>
-        <w:t xml:space="preserve">    assert np.isclose(f1_score(y_true, y_pred), m["f1"])</w:t>
+        <w:t xml:space="preserve"> </w:t>
       </w:r>
     </w:p>
     <w:p>
@@ -9069,7 +9306,7 @@
           <w:rFonts w:ascii="Consolas" w:hAnsi="Consolas" w:eastAsia="Consolas"/>
           <w:sz w:val="17"/>
         </w:rPr>
-        <w:t xml:space="preserve">    assert np.isclose(precision_score(y_true, y_pred), m["precision"])</w:t>
+        <w:t>def auc_trapezoid(fpr, tpr):</w:t>
       </w:r>
     </w:p>
     <w:p>
@@ -9082,7 +9319,7 @@
           <w:rFonts w:ascii="Consolas" w:hAnsi="Consolas" w:eastAsia="Consolas"/>
           <w:sz w:val="17"/>
         </w:rPr>
-        <w:t xml:space="preserve">    assert np.isclose(recall_score(y_true, y_pred), m["recall"])</w:t>
+        <w:t xml:space="preserve">    return float(np.sum(np.diff(fpr) * (tpr[1:] + tpr[:-1]) / 2))</w:t>
       </w:r>
     </w:p>
     <w:p>
@@ -9095,7 +9332,7 @@
           <w:rFonts w:ascii="Consolas" w:hAnsi="Consolas" w:eastAsia="Consolas"/>
           <w:sz w:val="17"/>
         </w:rPr>
-        <w:t xml:space="preserve">    assert np.isclose(recall_score(y_true, y_pred, pos_label=0), m["specificity"])</w:t>
+        <w:t xml:space="preserve"> </w:t>
       </w:r>
     </w:p>
     <w:p>
@@ -9121,7 +9358,7 @@
           <w:rFonts w:ascii="Consolas" w:hAnsi="Consolas" w:eastAsia="Consolas"/>
           <w:sz w:val="17"/>
         </w:rPr>
-        <w:t xml:space="preserve">    # ROC &amp; AUC tren mo hinh that</w:t>
+        <w:t># Vi du u ac tinh (slide 20)</w:t>
       </w:r>
     </w:p>
     <w:p>
@@ -9134,7 +9371,7 @@
           <w:rFonts w:ascii="Consolas" w:hAnsi="Consolas" w:eastAsia="Consolas"/>
           <w:sz w:val="17"/>
         </w:rPr>
-        <w:t xml:space="preserve">    X, y = make_classification(n_samples=1000, n_features=10, weights=[0.8], random_state=3)</w:t>
+        <w:t>m = metrics_from_cm(tp=1, fp=1, tn=90, fn=8)</w:t>
       </w:r>
     </w:p>
     <w:p>
@@ -9147,7 +9384,7 @@
           <w:rFonts w:ascii="Consolas" w:hAnsi="Consolas" w:eastAsia="Consolas"/>
           <w:sz w:val="17"/>
         </w:rPr>
-        <w:t xml:space="preserve">    Xtr, Xte, ytr, yte = train_test_split(X, y, test_size=0.3, random_state=0, stratify=y)</w:t>
+        <w:t>print({k: round(v, 3) for k, v in m.items()})</w:t>
       </w:r>
     </w:p>
     <w:p>
@@ -9160,7 +9397,7 @@
           <w:rFonts w:ascii="Consolas" w:hAnsi="Consolas" w:eastAsia="Consolas"/>
           <w:sz w:val="17"/>
         </w:rPr>
-        <w:t xml:space="preserve">    models = {"LogReg": LogisticRegression(max_iter=1000), "GaussianNB": GaussianNB(),</w:t>
+        <w:t>assert round(m["acc"], 2) == 0.91 and m["precision"] == 0.5 and round(m["recall"], 2) == 0.11</w:t>
       </w:r>
     </w:p>
     <w:p>
@@ -9173,7 +9410,7 @@
           <w:rFonts w:ascii="Consolas" w:hAnsi="Consolas" w:eastAsia="Consolas"/>
           <w:sz w:val="17"/>
         </w:rPr>
-        <w:t xml:space="preserve">              "KNN(k=5)": KNeighborsClassifier()}</w:t>
+        <w:t xml:space="preserve"> </w:t>
       </w:r>
     </w:p>
     <w:p>
@@ -9186,7 +9423,7 @@
           <w:rFonts w:ascii="Consolas" w:hAnsi="Consolas" w:eastAsia="Consolas"/>
           <w:sz w:val="17"/>
         </w:rPr>
-        <w:t xml:space="preserve">    curves = {}</w:t>
+        <w:t># Doi chieu voi sklearn</w:t>
       </w:r>
     </w:p>
     <w:p>
@@ -9199,7 +9436,7 @@
           <w:rFonts w:ascii="Consolas" w:hAnsi="Consolas" w:eastAsia="Consolas"/>
           <w:sz w:val="17"/>
         </w:rPr>
-        <w:t xml:space="preserve">    for name, mdl in models.items():</w:t>
+        <w:t>y_true = np.array([1] * 9 + [0] * 91)</w:t>
       </w:r>
     </w:p>
     <w:p>
@@ -9212,7 +9449,7 @@
           <w:rFonts w:ascii="Consolas" w:hAnsi="Consolas" w:eastAsia="Consolas"/>
           <w:sz w:val="17"/>
         </w:rPr>
-        <w:t xml:space="preserve">        score = mdl.fit(Xtr, ytr).predict_proba(Xte)[:, 1]</w:t>
+        <w:t>y_pred = np.array([1] + [0] * 8 + [1] + [0] * 90)</w:t>
       </w:r>
     </w:p>
     <w:p>
@@ -9225,7 +9462,7 @@
           <w:rFonts w:ascii="Consolas" w:hAnsi="Consolas" w:eastAsia="Consolas"/>
           <w:sz w:val="17"/>
         </w:rPr>
-        <w:t xml:space="preserve">        fpr, tpr, _ = roc_curve(yte, score)</w:t>
+        <w:t>tn, fp, fn, tp = confusion_matrix(y_true, y_pred).ravel()</w:t>
       </w:r>
     </w:p>
     <w:p>
@@ -9238,7 +9475,7 @@
           <w:rFonts w:ascii="Consolas" w:hAnsi="Consolas" w:eastAsia="Consolas"/>
           <w:sz w:val="17"/>
         </w:rPr>
-        <w:t xml:space="preserve">        auc = roc_auc_score(yte, score)</w:t>
+        <w:t>assert (tp, fp, tn, fn) == (1, 1, 90, 8)</w:t>
       </w:r>
     </w:p>
     <w:p>
@@ -9251,7 +9488,7 @@
           <w:rFonts w:ascii="Consolas" w:hAnsi="Consolas" w:eastAsia="Consolas"/>
           <w:sz w:val="17"/>
         </w:rPr>
-        <w:t xml:space="preserve">        assert np.isclose(auc, auc_trapezoid(fpr, tpr))</w:t>
+        <w:t>assert np.isclose(f1_score(y_true, y_pred), m["f1"])</w:t>
       </w:r>
     </w:p>
     <w:p>
@@ -9264,7 +9501,7 @@
           <w:rFonts w:ascii="Consolas" w:hAnsi="Consolas" w:eastAsia="Consolas"/>
           <w:sz w:val="17"/>
         </w:rPr>
-        <w:t xml:space="preserve">        curves[name] = (fpr, tpr, auc)</w:t>
+        <w:t>assert np.isclose(precision_score(y_true, y_pred), m["precision"])</w:t>
       </w:r>
     </w:p>
     <w:p>
@@ -9277,7 +9514,7 @@
           <w:rFonts w:ascii="Consolas" w:hAnsi="Consolas" w:eastAsia="Consolas"/>
           <w:sz w:val="17"/>
         </w:rPr>
-        <w:t xml:space="preserve">        yh = (score &gt;= 0.5).astype(int)</w:t>
+        <w:t>assert np.isclose(recall_score(y_true, y_pred), m["recall"])</w:t>
       </w:r>
     </w:p>
     <w:p>
@@ -9290,7 +9527,7 @@
           <w:rFonts w:ascii="Consolas" w:hAnsi="Consolas" w:eastAsia="Consolas"/>
           <w:sz w:val="17"/>
         </w:rPr>
-        <w:t xml:space="preserve">        print(f"{name:&lt;10} ACC={accuracy_score(yte, yh):.3f} P={precision_score(yte, yh):.3f} "</w:t>
+        <w:t>assert np.isclose(recall_score(y_true, y_pred, pos_label=0), m["specificity"])</w:t>
       </w:r>
     </w:p>
     <w:p>
@@ -9303,7 +9540,7 @@
           <w:rFonts w:ascii="Consolas" w:hAnsi="Consolas" w:eastAsia="Consolas"/>
           <w:sz w:val="17"/>
         </w:rPr>
-        <w:t xml:space="preserve">              f"R={recall_score(yte, yh):.3f} Spec={recall_score(yte, yh, pos_label=0):.3f} "</w:t>
+        <w:t xml:space="preserve"> </w:t>
       </w:r>
     </w:p>
     <w:p>
@@ -9316,7 +9553,7 @@
           <w:rFonts w:ascii="Consolas" w:hAnsi="Consolas" w:eastAsia="Consolas"/>
           <w:sz w:val="17"/>
         </w:rPr>
-        <w:t xml:space="preserve">              f"F1={f1_score(yte, yh):.3f} AUC={auc:.3f}")</w:t>
+        <w:t># ROC &amp; AUC tren mo hinh that</w:t>
       </w:r>
     </w:p>
     <w:p>
@@ -9329,7 +9566,7 @@
           <w:rFonts w:ascii="Consolas" w:hAnsi="Consolas" w:eastAsia="Consolas"/>
           <w:sz w:val="17"/>
         </w:rPr>
-        <w:t xml:space="preserve"> </w:t>
+        <w:t>X, y = make_classification(n_samples=1000, n_features=10, weights=[0.8], random_state=3)</w:t>
       </w:r>
     </w:p>
     <w:p>
@@ -9342,7 +9579,7 @@
           <w:rFonts w:ascii="Consolas" w:hAnsi="Consolas" w:eastAsia="Consolas"/>
           <w:sz w:val="17"/>
         </w:rPr>
-        <w:t xml:space="preserve">    if save_plot:</w:t>
+        <w:t>Xtr, Xte, ytr, yte = train_test_split(X, y, test_size=0.3, random_state=0, stratify=y)</w:t>
       </w:r>
     </w:p>
     <w:p>
@@ -9355,7 +9592,7 @@
           <w:rFonts w:ascii="Consolas" w:hAnsi="Consolas" w:eastAsia="Consolas"/>
           <w:sz w:val="17"/>
         </w:rPr>
-        <w:t xml:space="preserve">        import matplotlib</w:t>
+        <w:t>models = {"LogReg": LogisticRegression(max_iter=1000), "GaussianNB": GaussianNB(),</w:t>
       </w:r>
     </w:p>
     <w:p>
@@ -9368,7 +9605,7 @@
           <w:rFonts w:ascii="Consolas" w:hAnsi="Consolas" w:eastAsia="Consolas"/>
           <w:sz w:val="17"/>
         </w:rPr>
-        <w:t xml:space="preserve">        matplotlib.use("Agg")</w:t>
+        <w:t xml:space="preserve">          "KNN(k=5)": KNeighborsClassifier()}</w:t>
       </w:r>
     </w:p>
     <w:p>
@@ -9381,7 +9618,7 @@
           <w:rFonts w:ascii="Consolas" w:hAnsi="Consolas" w:eastAsia="Consolas"/>
           <w:sz w:val="17"/>
         </w:rPr>
-        <w:t xml:space="preserve">        import matplotlib.pyplot as plt</w:t>
+        <w:t>curves = {}</w:t>
       </w:r>
     </w:p>
     <w:p>
@@ -9394,7 +9631,7 @@
           <w:rFonts w:ascii="Consolas" w:hAnsi="Consolas" w:eastAsia="Consolas"/>
           <w:sz w:val="17"/>
         </w:rPr>
-        <w:t xml:space="preserve">        fig, ax = plt.subplots(figsize=(5, 4.5))</w:t>
+        <w:t>for name, mdl in models.items():</w:t>
       </w:r>
     </w:p>
     <w:p>
@@ -9407,7 +9644,7 @@
           <w:rFonts w:ascii="Consolas" w:hAnsi="Consolas" w:eastAsia="Consolas"/>
           <w:sz w:val="17"/>
         </w:rPr>
-        <w:t xml:space="preserve">        for name, (fpr, tpr, auc) in curves.items():</w:t>
+        <w:t xml:space="preserve">    score = mdl.fit(Xtr, ytr).predict_proba(Xte)[:, 1]</w:t>
       </w:r>
     </w:p>
     <w:p>
@@ -9420,7 +9657,7 @@
           <w:rFonts w:ascii="Consolas" w:hAnsi="Consolas" w:eastAsia="Consolas"/>
           <w:sz w:val="17"/>
         </w:rPr>
-        <w:t xml:space="preserve">            ax.plot(fpr, tpr, label=f"{name} (AUC={auc:.3f})")</w:t>
+        <w:t xml:space="preserve">    fpr, tpr, _ = roc_curve(yte, score)</w:t>
       </w:r>
     </w:p>
     <w:p>
@@ -9433,7 +9670,7 @@
           <w:rFonts w:ascii="Consolas" w:hAnsi="Consolas" w:eastAsia="Consolas"/>
           <w:sz w:val="17"/>
         </w:rPr>
-        <w:t xml:space="preserve">        ax.plot([0, 1], [0, 1], "--", color="gray", label="Ngau nhien (AUC=0.5)")</w:t>
+        <w:t xml:space="preserve">    auc = roc_auc_score(yte, score)</w:t>
       </w:r>
     </w:p>
     <w:p>
@@ -9446,7 +9683,7 @@
           <w:rFonts w:ascii="Consolas" w:hAnsi="Consolas" w:eastAsia="Consolas"/>
           <w:sz w:val="17"/>
         </w:rPr>
-        <w:t xml:space="preserve">        ax.set_xlabel("FPR = 1 - Specificity")</w:t>
+        <w:t xml:space="preserve">    assert np.isclose(auc, auc_trapezoid(fpr, tpr))</w:t>
       </w:r>
     </w:p>
     <w:p>
@@ -9459,7 +9696,7 @@
           <w:rFonts w:ascii="Consolas" w:hAnsi="Consolas" w:eastAsia="Consolas"/>
           <w:sz w:val="17"/>
         </w:rPr>
-        <w:t xml:space="preserve">        ax.set_ylabel("TPR = Recall / Sensitivity")</w:t>
+        <w:t xml:space="preserve">    curves[name] = (fpr, tpr, auc)</w:t>
       </w:r>
     </w:p>
     <w:p>
@@ -9472,7 +9709,7 @@
           <w:rFonts w:ascii="Consolas" w:hAnsi="Consolas" w:eastAsia="Consolas"/>
           <w:sz w:val="17"/>
         </w:rPr>
-        <w:t xml:space="preserve">        ax.set_title("Duong cong ROC")</w:t>
+        <w:t xml:space="preserve">    yh = (score &gt;= 0.5).astype(int)</w:t>
       </w:r>
     </w:p>
     <w:p>
@@ -9485,7 +9722,7 @@
           <w:rFonts w:ascii="Consolas" w:hAnsi="Consolas" w:eastAsia="Consolas"/>
           <w:sz w:val="17"/>
         </w:rPr>
-        <w:t xml:space="preserve">        ax.legend(loc="lower right")</w:t>
+        <w:t xml:space="preserve">    print(f"{name:&lt;10} ACC={accuracy_score(yte, yh):.3f} P={precision_score(yte, yh):.3f} "</w:t>
       </w:r>
     </w:p>
     <w:p>
@@ -9498,7 +9735,7 @@
           <w:rFonts w:ascii="Consolas" w:hAnsi="Consolas" w:eastAsia="Consolas"/>
           <w:sz w:val="17"/>
         </w:rPr>
-        <w:t xml:space="preserve">        fig.tight_layout()</w:t>
+        <w:t xml:space="preserve">          f"R={recall_score(yte, yh):.3f} Spec={recall_score(yte, yh, pos_label=0):.3f} "</w:t>
       </w:r>
     </w:p>
     <w:p>
@@ -9511,7 +9748,202 @@
           <w:rFonts w:ascii="Consolas" w:hAnsi="Consolas" w:eastAsia="Consolas"/>
           <w:sz w:val="17"/>
         </w:rPr>
-        <w:t xml:space="preserve">        fig.savefig(save_plot, dpi=150)</w:t>
+        <w:t xml:space="preserve">          f"F1={f1_score(yte, yh):.3f} AUC={auc:.3f}")</w:t>
+      </w:r>
+    </w:p>
+    <w:p>
+      <w:pPr>
+        <w:shd w:val="clear" w:color="auto" w:fill="F3F4F6"/>
+        <w:spacing w:after="0" w:before="0" w:line="240" w:lineRule="auto"/>
+      </w:pPr>
+      <w:r>
+        <w:rPr>
+          <w:rFonts w:ascii="Consolas" w:hAnsi="Consolas" w:eastAsia="Consolas"/>
+          <w:sz w:val="17"/>
+        </w:rPr>
+        <w:t xml:space="preserve"> </w:t>
+      </w:r>
+    </w:p>
+    <w:p>
+      <w:pPr>
+        <w:shd w:val="clear" w:color="auto" w:fill="F3F4F6"/>
+        <w:spacing w:after="0" w:before="0" w:line="240" w:lineRule="auto"/>
+      </w:pPr>
+      <w:r>
+        <w:rPr>
+          <w:rFonts w:ascii="Consolas" w:hAnsi="Consolas" w:eastAsia="Consolas"/>
+          <w:sz w:val="17"/>
+        </w:rPr>
+        <w:t>if len(sys.argv) &gt; 1:</w:t>
+      </w:r>
+    </w:p>
+    <w:p>
+      <w:pPr>
+        <w:shd w:val="clear" w:color="auto" w:fill="F3F4F6"/>
+        <w:spacing w:after="0" w:before="0" w:line="240" w:lineRule="auto"/>
+      </w:pPr>
+      <w:r>
+        <w:rPr>
+          <w:rFonts w:ascii="Consolas" w:hAnsi="Consolas" w:eastAsia="Consolas"/>
+          <w:sz w:val="17"/>
+        </w:rPr>
+        <w:t xml:space="preserve">    import matplotlib</w:t>
+      </w:r>
+    </w:p>
+    <w:p>
+      <w:pPr>
+        <w:shd w:val="clear" w:color="auto" w:fill="F3F4F6"/>
+        <w:spacing w:after="0" w:before="0" w:line="240" w:lineRule="auto"/>
+      </w:pPr>
+      <w:r>
+        <w:rPr>
+          <w:rFonts w:ascii="Consolas" w:hAnsi="Consolas" w:eastAsia="Consolas"/>
+          <w:sz w:val="17"/>
+        </w:rPr>
+        <w:t xml:space="preserve">    matplotlib.use("Agg")</w:t>
+      </w:r>
+    </w:p>
+    <w:p>
+      <w:pPr>
+        <w:shd w:val="clear" w:color="auto" w:fill="F3F4F6"/>
+        <w:spacing w:after="0" w:before="0" w:line="240" w:lineRule="auto"/>
+      </w:pPr>
+      <w:r>
+        <w:rPr>
+          <w:rFonts w:ascii="Consolas" w:hAnsi="Consolas" w:eastAsia="Consolas"/>
+          <w:sz w:val="17"/>
+        </w:rPr>
+        <w:t xml:space="preserve">    import matplotlib.pyplot as plt</w:t>
+      </w:r>
+    </w:p>
+    <w:p>
+      <w:pPr>
+        <w:shd w:val="clear" w:color="auto" w:fill="F3F4F6"/>
+        <w:spacing w:after="0" w:before="0" w:line="240" w:lineRule="auto"/>
+      </w:pPr>
+      <w:r>
+        <w:rPr>
+          <w:rFonts w:ascii="Consolas" w:hAnsi="Consolas" w:eastAsia="Consolas"/>
+          <w:sz w:val="17"/>
+        </w:rPr>
+        <w:t xml:space="preserve">    fig, ax = plt.subplots(figsize=(5, 4.5))</w:t>
+      </w:r>
+    </w:p>
+    <w:p>
+      <w:pPr>
+        <w:shd w:val="clear" w:color="auto" w:fill="F3F4F6"/>
+        <w:spacing w:after="0" w:before="0" w:line="240" w:lineRule="auto"/>
+      </w:pPr>
+      <w:r>
+        <w:rPr>
+          <w:rFonts w:ascii="Consolas" w:hAnsi="Consolas" w:eastAsia="Consolas"/>
+          <w:sz w:val="17"/>
+        </w:rPr>
+        <w:t xml:space="preserve">    for name, (fpr, tpr, auc) in curves.items():</w:t>
+      </w:r>
+    </w:p>
+    <w:p>
+      <w:pPr>
+        <w:shd w:val="clear" w:color="auto" w:fill="F3F4F6"/>
+        <w:spacing w:after="0" w:before="0" w:line="240" w:lineRule="auto"/>
+      </w:pPr>
+      <w:r>
+        <w:rPr>
+          <w:rFonts w:ascii="Consolas" w:hAnsi="Consolas" w:eastAsia="Consolas"/>
+          <w:sz w:val="17"/>
+        </w:rPr>
+        <w:t xml:space="preserve">        ax.plot(fpr, tpr, label=f"{name} (AUC={auc:.3f})")</w:t>
+      </w:r>
+    </w:p>
+    <w:p>
+      <w:pPr>
+        <w:shd w:val="clear" w:color="auto" w:fill="F3F4F6"/>
+        <w:spacing w:after="0" w:before="0" w:line="240" w:lineRule="auto"/>
+      </w:pPr>
+      <w:r>
+        <w:rPr>
+          <w:rFonts w:ascii="Consolas" w:hAnsi="Consolas" w:eastAsia="Consolas"/>
+          <w:sz w:val="17"/>
+        </w:rPr>
+        <w:t xml:space="preserve">    ax.plot([0, 1], [0, 1], "--", color="gray", label="Ngau nhien (AUC=0.5)")</w:t>
+      </w:r>
+    </w:p>
+    <w:p>
+      <w:pPr>
+        <w:shd w:val="clear" w:color="auto" w:fill="F3F4F6"/>
+        <w:spacing w:after="0" w:before="0" w:line="240" w:lineRule="auto"/>
+      </w:pPr>
+      <w:r>
+        <w:rPr>
+          <w:rFonts w:ascii="Consolas" w:hAnsi="Consolas" w:eastAsia="Consolas"/>
+          <w:sz w:val="17"/>
+        </w:rPr>
+        <w:t xml:space="preserve">    ax.set_xlabel("FPR = 1 - Specificity")</w:t>
+      </w:r>
+    </w:p>
+    <w:p>
+      <w:pPr>
+        <w:shd w:val="clear" w:color="auto" w:fill="F3F4F6"/>
+        <w:spacing w:after="0" w:before="0" w:line="240" w:lineRule="auto"/>
+      </w:pPr>
+      <w:r>
+        <w:rPr>
+          <w:rFonts w:ascii="Consolas" w:hAnsi="Consolas" w:eastAsia="Consolas"/>
+          <w:sz w:val="17"/>
+        </w:rPr>
+        <w:t xml:space="preserve">    ax.set_ylabel("TPR = Recall / Sensitivity")</w:t>
+      </w:r>
+    </w:p>
+    <w:p>
+      <w:pPr>
+        <w:shd w:val="clear" w:color="auto" w:fill="F3F4F6"/>
+        <w:spacing w:after="0" w:before="0" w:line="240" w:lineRule="auto"/>
+      </w:pPr>
+      <w:r>
+        <w:rPr>
+          <w:rFonts w:ascii="Consolas" w:hAnsi="Consolas" w:eastAsia="Consolas"/>
+          <w:sz w:val="17"/>
+        </w:rPr>
+        <w:t xml:space="preserve">    ax.set_title("Duong cong ROC")</w:t>
+      </w:r>
+    </w:p>
+    <w:p>
+      <w:pPr>
+        <w:shd w:val="clear" w:color="auto" w:fill="F3F4F6"/>
+        <w:spacing w:after="0" w:before="0" w:line="240" w:lineRule="auto"/>
+      </w:pPr>
+      <w:r>
+        <w:rPr>
+          <w:rFonts w:ascii="Consolas" w:hAnsi="Consolas" w:eastAsia="Consolas"/>
+          <w:sz w:val="17"/>
+        </w:rPr>
+        <w:t xml:space="preserve">    ax.legend(loc="lower right")</w:t>
+      </w:r>
+    </w:p>
+    <w:p>
+      <w:pPr>
+        <w:shd w:val="clear" w:color="auto" w:fill="F3F4F6"/>
+        <w:spacing w:after="0" w:before="0" w:line="240" w:lineRule="auto"/>
+      </w:pPr>
+      <w:r>
+        <w:rPr>
+          <w:rFonts w:ascii="Consolas" w:hAnsi="Consolas" w:eastAsia="Consolas"/>
+          <w:sz w:val="17"/>
+        </w:rPr>
+        <w:t xml:space="preserve">    fig.tight_layout()</w:t>
+      </w:r>
+    </w:p>
+    <w:p>
+      <w:pPr>
+        <w:shd w:val="clear" w:color="auto" w:fill="F3F4F6"/>
+        <w:spacing w:after="0" w:before="0" w:line="240" w:lineRule="auto"/>
+      </w:pPr>
+      <w:r>
+        <w:rPr>
+          <w:rFonts w:ascii="Consolas" w:hAnsi="Consolas" w:eastAsia="Consolas"/>
+          <w:sz w:val="17"/>
+        </w:rPr>
+        <w:t xml:space="preserve">    fig.savefig(sys.argv[1], dpi=150)</w:t>
       </w:r>
     </w:p>
     <w:p>
@@ -9537,7 +9969,7 @@
           <w:rFonts w:ascii="Consolas" w:hAnsi="Consolas" w:eastAsia="Consolas"/>
           <w:sz w:val="17"/>
         </w:rPr>
-        <w:t>=== CAU 5: Do do hieu suat ===</w:t>
+        <w:t>{'acc': 0.91, 'precision': 0.5, 'recall': 0.111, 'specificity': 0.989, 'f1': 0.182}</w:t>
       </w:r>
     </w:p>
     <w:p>
@@ -9550,7 +9982,7 @@
           <w:rFonts w:ascii="Consolas" w:hAnsi="Consolas" w:eastAsia="Consolas"/>
           <w:sz w:val="17"/>
         </w:rPr>
-        <w:t>{'acc': 0.91, 'precision': 0.5, 'recall': 0.111, 'specificity': 0.989, 'f1': 0.182}</w:t>
+        <w:t>LogReg     ACC=0.880 P=0.736 R=0.639 Spec=0.941 F1=0.684 AUC=0.919</w:t>
       </w:r>
     </w:p>
     <w:p>
@@ -9563,7 +9995,7 @@
           <w:rFonts w:ascii="Consolas" w:hAnsi="Consolas" w:eastAsia="Consolas"/>
           <w:sz w:val="17"/>
         </w:rPr>
-        <w:t>LogReg     ACC=0.880 P=0.736 R=0.639 Spec=0.941 F1=0.684 AUC=0.919</w:t>
+        <w:t>GaussianNB ACC=0.887 P=0.714 R=0.738 Spec=0.925 F1=0.726 AUC=0.924</w:t>
       </w:r>
     </w:p>
     <w:p>
@@ -9576,46 +10008,7 @@
           <w:rFonts w:ascii="Consolas" w:hAnsi="Consolas" w:eastAsia="Consolas"/>
           <w:sz w:val="17"/>
         </w:rPr>
-        <w:t>GaussianNB ACC=0.887 P=0.714 R=0.738 Spec=0.925 F1=0.726 AUC=0.924</w:t>
-      </w:r>
-    </w:p>
-    <w:p>
-      <w:pPr>
-        <w:shd w:val="clear" w:color="auto" w:fill="E8F3EC"/>
-        <w:spacing w:after="0" w:before="0" w:line="240" w:lineRule="auto"/>
-      </w:pPr>
-      <w:r>
-        <w:rPr>
-          <w:rFonts w:ascii="Consolas" w:hAnsi="Consolas" w:eastAsia="Consolas"/>
-          <w:sz w:val="17"/>
-        </w:rPr>
         <w:t>KNN(k=5)   ACC=0.907 P=0.824 R=0.689 Spec=0.962 F1=0.750 AUC=0.947</w:t>
-      </w:r>
-    </w:p>
-    <w:p>
-      <w:pPr>
-        <w:shd w:val="clear" w:color="auto" w:fill="E8F3EC"/>
-        <w:spacing w:after="0" w:before="0" w:line="240" w:lineRule="auto"/>
-      </w:pPr>
-      <w:r>
-        <w:rPr>
-          <w:rFonts w:ascii="Consolas" w:hAnsi="Consolas" w:eastAsia="Consolas"/>
-          <w:sz w:val="17"/>
-        </w:rPr>
-        <w:t xml:space="preserve"> </w:t>
-      </w:r>
-    </w:p>
-    <w:p>
-      <w:pPr>
-        <w:shd w:val="clear" w:color="auto" w:fill="E8F3EC"/>
-        <w:spacing w:after="0" w:before="0" w:line="240" w:lineRule="auto"/>
-      </w:pPr>
-      <w:r>
-        <w:rPr>
-          <w:rFonts w:ascii="Consolas" w:hAnsi="Consolas" w:eastAsia="Consolas"/>
-          <w:sz w:val="17"/>
-        </w:rPr>
-        <w:t>Tat ca kiem tra deu PASS.</w:t>
       </w:r>
     </w:p>
     <w:p>

</xml_diff>